<commit_message>
TS 4.4 Kramam comparison Tamil and Sanskrit
</commit_message>
<xml_diff>
--- a/TS-Kramam/TS-4.4/TS 4.4 Sanskrit Krama Paatam Corrections.docx
+++ b/TS-Kramam/TS-4.4/TS 4.4 Sanskrit Krama Paatam Corrections.docx
@@ -1,7 +1,1340 @@
 
 <file path=word/document.xml><?xml version="1.0" encoding="utf-8"?>
-<w:document xmlns:wpc="http://schemas.microsoft.com/office/word/2010/wordprocessingCanvas" xmlns:cx="http://schemas.microsoft.com/office/drawing/2014/chartex" xmlns:cx1="http://schemas.microsoft.com/office/drawing/2015/9/8/chartex" xmlns:mc="http://schemas.openxmlformats.org/markup-compatibility/2006" xmlns:o="urn:schemas-microsoft-com:office:office" xmlns:r="http://schemas.openxmlformats.org/officeDocument/2006/relationships" xmlns:m="http://schemas.openxmlformats.org/officeDocument/2006/math" xmlns:v="urn:schemas-microsoft-com:vml" xmlns:wp14="http://schemas.microsoft.com/office/word/2010/wordprocessingDrawing" xmlns:wp="http://schemas.openxmlformats.org/drawingml/2006/wordprocessingDrawing" xmlns:w10="urn:schemas-microsoft-com:office:word" xmlns:w="http://schemas.openxmlformats.org/wordprocessingml/2006/main" xmlns:w14="http://schemas.microsoft.com/office/word/2010/wordml" xmlns:w15="http://schemas.microsoft.com/office/word/2012/wordml" xmlns:w16se="http://schemas.microsoft.com/office/word/2015/wordml/symex" xmlns:wpg="http://schemas.microsoft.com/office/word/2010/wordprocessingGroup" xmlns:wpi="http://schemas.microsoft.com/office/word/2010/wordprocessingInk" xmlns:wne="http://schemas.microsoft.com/office/word/2006/wordml" xmlns:wps="http://schemas.microsoft.com/office/word/2010/wordprocessingShape" mc:Ignorable="w14 w15 w16se wp14">
+<w:document xmlns:wpc="http://schemas.microsoft.com/office/word/2010/wordprocessingCanvas" xmlns:cx="http://schemas.microsoft.com/office/drawing/2014/chartex" xmlns:cx1="http://schemas.microsoft.com/office/drawing/2015/9/8/chartex" xmlns:cx2="http://schemas.microsoft.com/office/drawing/2015/10/21/chartex" xmlns:cx3="http://schemas.microsoft.com/office/drawing/2016/5/9/chartex" xmlns:cx4="http://schemas.microsoft.com/office/drawing/2016/5/10/chartex" xmlns:cx5="http://schemas.microsoft.com/office/drawing/2016/5/11/chartex" xmlns:cx6="http://schemas.microsoft.com/office/drawing/2016/5/12/chartex" xmlns:cx7="http://schemas.microsoft.com/office/drawing/2016/5/13/chartex" xmlns:cx8="http://schemas.microsoft.com/office/drawing/2016/5/14/chartex" xmlns:mc="http://schemas.openxmlformats.org/markup-compatibility/2006" xmlns:aink="http://schemas.microsoft.com/office/drawing/2016/ink" xmlns:am3d="http://schemas.microsoft.com/office/drawing/2017/model3d" xmlns:o="urn:schemas-microsoft-com:office:office" xmlns:oel="http://schemas.microsoft.com/office/2019/extlst" xmlns:r="http://schemas.openxmlformats.org/officeDocument/2006/relationships" xmlns:m="http://schemas.openxmlformats.org/officeDocument/2006/math" xmlns:v="urn:schemas-microsoft-com:vml" xmlns:wp14="http://schemas.microsoft.com/office/word/2010/wordprocessingDrawing" xmlns:wp="http://schemas.openxmlformats.org/drawingml/2006/wordprocessingDrawing" xmlns:w10="urn:schemas-microsoft-com:office:word" xmlns:w="http://schemas.openxmlformats.org/wordprocessingml/2006/main" xmlns:w14="http://schemas.microsoft.com/office/word/2010/wordml" xmlns:w15="http://schemas.microsoft.com/office/word/2012/wordml" xmlns:w16cei="http://schemas.microsoft.com/office/word/2026/wordml/cei" xmlns:w16cex="http://schemas.microsoft.com/office/word/2018/wordml/cex" xmlns:w16cid="http://schemas.microsoft.com/office/word/2016/wordml/cid" xmlns:w16="http://schemas.microsoft.com/office/word/2018/wordml" xmlns:w16du="http://schemas.microsoft.com/office/word/2023/wordml/word16du" xmlns:w16sdtdh="http://schemas.microsoft.com/office/word/2020/wordml/sdtdatahash" xmlns:w16sdtfl="http://schemas.microsoft.com/office/word/2024/wordml/sdtformatlock" xmlns:w16se="http://schemas.microsoft.com/office/word/2015/wordml/symex" xmlns:wpg="http://schemas.microsoft.com/office/word/2010/wordprocessingGroup" xmlns:wpi="http://schemas.microsoft.com/office/word/2010/wordprocessingInk" xmlns:wne="http://schemas.microsoft.com/office/word/2006/wordml" xmlns:wps="http://schemas.microsoft.com/office/word/2010/wordprocessingShape" mc:Ignorable="w14 w15 w16se w16cid w16 w16cex w16sdtdh w16sdtfl w16du wp14">
   <w:body>
+    <w:p>
+      <w:pPr>
+        <w:jc w:val="center"/>
+        <w:rPr>
+          <w:b/>
+          <w:bCs/>
+          <w:color w:val="EE0000"/>
+          <w:sz w:val="32"/>
+          <w:szCs w:val="32"/>
+          <w:u w:val="single"/>
+        </w:rPr>
+      </w:pPr>
+      <w:r>
+        <w:rPr>
+          <w:b/>
+          <w:bCs/>
+          <w:sz w:val="32"/>
+          <w:szCs w:val="32"/>
+          <w:u w:val="single"/>
+        </w:rPr>
+        <w:t xml:space="preserve">TS </w:t>
+      </w:r>
+      <w:r>
+        <w:rPr>
+          <w:b/>
+          <w:bCs/>
+          <w:sz w:val="32"/>
+          <w:szCs w:val="32"/>
+          <w:u w:val="single"/>
+        </w:rPr>
+        <w:t>Krama</w:t>
+      </w:r>
+      <w:r>
+        <w:rPr>
+          <w:b/>
+          <w:bCs/>
+          <w:sz w:val="32"/>
+          <w:szCs w:val="32"/>
+          <w:u w:val="single"/>
+        </w:rPr>
+        <w:t xml:space="preserve"> Paatam – TS </w:t>
+      </w:r>
+      <w:r>
+        <w:rPr>
+          <w:b/>
+          <w:bCs/>
+          <w:sz w:val="32"/>
+          <w:szCs w:val="32"/>
+          <w:u w:val="single"/>
+        </w:rPr>
+        <w:t>4.4 Sanskrit</w:t>
+      </w:r>
+      <w:r>
+        <w:rPr>
+          <w:b/>
+          <w:bCs/>
+          <w:sz w:val="32"/>
+          <w:szCs w:val="32"/>
+          <w:u w:val="single"/>
+        </w:rPr>
+        <w:t xml:space="preserve"> Corrections –</w:t>
+      </w:r>
+      <w:r>
+        <w:rPr>
+          <w:b/>
+          <w:bCs/>
+          <w:sz w:val="32"/>
+          <w:szCs w:val="32"/>
+          <w:u w:val="single"/>
+        </w:rPr>
+        <w:t xml:space="preserve"> </w:t>
+      </w:r>
+      <w:r>
+        <w:rPr>
+          <w:b/>
+          <w:bCs/>
+          <w:sz w:val="32"/>
+          <w:szCs w:val="32"/>
+          <w:u w:val="single"/>
+        </w:rPr>
+        <w:t xml:space="preserve">Observed till </w:t>
+      </w:r>
+      <w:proofErr w:type="spellStart"/>
+      <w:r>
+        <w:rPr>
+          <w:b/>
+          <w:bCs/>
+          <w:color w:val="EE0000"/>
+          <w:sz w:val="32"/>
+          <w:szCs w:val="32"/>
+          <w:highlight w:val="yellow"/>
+          <w:u w:val="single"/>
+        </w:rPr>
+        <w:t>xxxxxxxxx</w:t>
+      </w:r>
+      <w:proofErr w:type="spellEnd"/>
+    </w:p>
+    <w:p>
+      <w:pPr>
+        <w:spacing w:before="0" w:line="240" w:lineRule="auto"/>
+        <w:jc w:val="center"/>
+        <w:rPr>
+          <w:b/>
+          <w:bCs/>
+        </w:rPr>
+      </w:pPr>
+      <w:r>
+        <w:rPr>
+          <w:b/>
+          <w:bCs/>
+        </w:rPr>
+        <w:t>(ignore those which are already incorporated in your book’s version and date)</w:t>
+      </w:r>
+    </w:p>
+    <w:tbl>
+      <w:tblPr>
+        <w:tblW w:w="14395" w:type="dxa"/>
+        <w:tblInd w:w="-792" w:type="dxa"/>
+        <w:tblBorders>
+          <w:top w:val="single" w:sz="4" w:space="0" w:color="000000"/>
+          <w:left w:val="single" w:sz="4" w:space="0" w:color="000000"/>
+          <w:bottom w:val="single" w:sz="4" w:space="0" w:color="000000"/>
+          <w:right w:val="single" w:sz="4" w:space="0" w:color="000000"/>
+          <w:insideH w:val="single" w:sz="4" w:space="0" w:color="000000"/>
+          <w:insideV w:val="single" w:sz="4" w:space="0" w:color="000000"/>
+        </w:tblBorders>
+        <w:tblLook w:val="04A0" w:firstRow="1" w:lastRow="0" w:firstColumn="1" w:lastColumn="0" w:noHBand="0" w:noVBand="1"/>
+      </w:tblPr>
+      <w:tblGrid>
+        <w:gridCol w:w="3906"/>
+        <w:gridCol w:w="5103"/>
+        <w:gridCol w:w="5386"/>
+      </w:tblGrid>
+      <w:tr>
+        <w:tc>
+          <w:tcPr>
+            <w:tcW w:w="3906" w:type="dxa"/>
+          </w:tcPr>
+          <w:p>
+            <w:pPr>
+              <w:spacing w:before="0" w:line="240" w:lineRule="auto"/>
+              <w:jc w:val="center"/>
+              <w:rPr>
+                <w:b/>
+                <w:bCs/>
+                <w:sz w:val="32"/>
+                <w:szCs w:val="32"/>
+              </w:rPr>
+            </w:pPr>
+            <w:r>
+              <w:rPr>
+                <w:b/>
+                <w:bCs/>
+                <w:sz w:val="32"/>
+                <w:szCs w:val="32"/>
+              </w:rPr>
+              <w:t>Section, Paragraph</w:t>
+            </w:r>
+          </w:p>
+          <w:p>
+            <w:pPr>
+              <w:spacing w:before="0" w:line="240" w:lineRule="auto"/>
+              <w:jc w:val="center"/>
+              <w:rPr>
+                <w:b/>
+                <w:bCs/>
+                <w:sz w:val="32"/>
+                <w:szCs w:val="32"/>
+              </w:rPr>
+            </w:pPr>
+            <w:r>
+              <w:rPr>
+                <w:b/>
+                <w:bCs/>
+                <w:sz w:val="32"/>
+                <w:szCs w:val="32"/>
+              </w:rPr>
+              <w:t>Reference</w:t>
+            </w:r>
+          </w:p>
+        </w:tc>
+        <w:tc>
+          <w:tcPr>
+            <w:tcW w:w="5103" w:type="dxa"/>
+          </w:tcPr>
+          <w:p>
+            <w:pPr>
+              <w:spacing w:before="0" w:line="240" w:lineRule="auto"/>
+              <w:jc w:val="center"/>
+              <w:rPr>
+                <w:b/>
+                <w:bCs/>
+                <w:sz w:val="32"/>
+                <w:szCs w:val="32"/>
+              </w:rPr>
+            </w:pPr>
+            <w:r>
+              <w:rPr>
+                <w:b/>
+                <w:bCs/>
+                <w:sz w:val="32"/>
+                <w:szCs w:val="32"/>
+              </w:rPr>
+              <w:t>As Printed</w:t>
+            </w:r>
+          </w:p>
+        </w:tc>
+        <w:tc>
+          <w:tcPr>
+            <w:tcW w:w="5386" w:type="dxa"/>
+          </w:tcPr>
+          <w:p>
+            <w:pPr>
+              <w:spacing w:before="0" w:line="240" w:lineRule="auto"/>
+              <w:ind w:right="-18"/>
+              <w:jc w:val="center"/>
+              <w:rPr>
+                <w:b/>
+                <w:bCs/>
+                <w:sz w:val="32"/>
+                <w:szCs w:val="32"/>
+              </w:rPr>
+            </w:pPr>
+            <w:r>
+              <w:rPr>
+                <w:b/>
+                <w:bCs/>
+                <w:sz w:val="32"/>
+                <w:szCs w:val="32"/>
+              </w:rPr>
+              <w:t>To be read as or corrected as</w:t>
+            </w:r>
+          </w:p>
+        </w:tc>
+      </w:tr>
+      <w:tr>
+        <w:trPr>
+          <w:trHeight w:val="1671"/>
+        </w:trPr>
+        <w:tc>
+          <w:tcPr>
+            <w:tcW w:w="3906" w:type="dxa"/>
+          </w:tcPr>
+          <w:p>
+            <w:pPr>
+              <w:widowControl w:val="0"/>
+              <w:tabs>
+                <w:tab w:val="left" w:pos="993"/>
+              </w:tabs>
+              <w:autoSpaceDE w:val="0"/>
+              <w:autoSpaceDN w:val="0"/>
+              <w:adjustRightInd w:val="0"/>
+              <w:spacing w:before="0" w:line="252" w:lineRule="auto"/>
+              <w:ind w:right="297"/>
+              <w:rPr>
+                <w:rFonts w:cs="Arial"/>
+                <w:b/>
+                <w:sz w:val="28"/>
+                <w:szCs w:val="32"/>
+              </w:rPr>
+            </w:pPr>
+            <w:r>
+              <w:rPr>
+                <w:rFonts w:cs="Arial"/>
+                <w:b/>
+                <w:sz w:val="28"/>
+                <w:szCs w:val="32"/>
+              </w:rPr>
+              <w:t>T.S.4.4.4</w:t>
+            </w:r>
+            <w:r>
+              <w:rPr>
+                <w:rFonts w:cs="Arial"/>
+                <w:b/>
+                <w:sz w:val="28"/>
+                <w:szCs w:val="32"/>
+              </w:rPr>
+              <w:t>.</w:t>
+            </w:r>
+            <w:r>
+              <w:rPr>
+                <w:rFonts w:cs="Arial"/>
+                <w:b/>
+                <w:sz w:val="28"/>
+                <w:szCs w:val="32"/>
+              </w:rPr>
+              <w:t>3</w:t>
+            </w:r>
+            <w:r>
+              <w:rPr>
+                <w:rFonts w:cs="Arial"/>
+                <w:b/>
+                <w:sz w:val="28"/>
+                <w:szCs w:val="32"/>
+              </w:rPr>
+              <w:t xml:space="preserve"> – Kramam</w:t>
+            </w:r>
+          </w:p>
+          <w:p>
+            <w:pPr>
+              <w:widowControl w:val="0"/>
+              <w:tabs>
+                <w:tab w:val="left" w:pos="993"/>
+              </w:tabs>
+              <w:autoSpaceDE w:val="0"/>
+              <w:autoSpaceDN w:val="0"/>
+              <w:adjustRightInd w:val="0"/>
+              <w:spacing w:before="0" w:line="252" w:lineRule="auto"/>
+              <w:ind w:right="297"/>
+              <w:rPr>
+                <w:rFonts w:cs="Arial"/>
+                <w:b/>
+                <w:sz w:val="28"/>
+                <w:szCs w:val="32"/>
+              </w:rPr>
+            </w:pPr>
+            <w:r>
+              <w:rPr>
+                <w:rFonts w:cs="Arial"/>
+                <w:b/>
+                <w:sz w:val="28"/>
+                <w:szCs w:val="32"/>
+              </w:rPr>
+              <w:t xml:space="preserve">Krama Vaakyam No.– </w:t>
+            </w:r>
+            <w:r>
+              <w:rPr>
+                <w:rFonts w:cs="Arial"/>
+                <w:b/>
+                <w:sz w:val="28"/>
+                <w:szCs w:val="32"/>
+              </w:rPr>
+              <w:t>45</w:t>
+            </w:r>
+          </w:p>
+          <w:p>
+            <w:pPr>
+              <w:widowControl w:val="0"/>
+              <w:tabs>
+                <w:tab w:val="left" w:pos="993"/>
+              </w:tabs>
+              <w:autoSpaceDE w:val="0"/>
+              <w:autoSpaceDN w:val="0"/>
+              <w:adjustRightInd w:val="0"/>
+              <w:spacing w:before="0" w:line="252" w:lineRule="auto"/>
+              <w:ind w:right="297"/>
+              <w:rPr>
+                <w:rFonts w:cs="Arial"/>
+                <w:b/>
+                <w:sz w:val="28"/>
+                <w:szCs w:val="32"/>
+              </w:rPr>
+            </w:pPr>
+            <w:r>
+              <w:rPr>
+                <w:rFonts w:cs="Arial"/>
+                <w:b/>
+                <w:sz w:val="28"/>
+                <w:szCs w:val="32"/>
+              </w:rPr>
+              <w:t>Panchaati No</w:t>
+            </w:r>
+            <w:r>
+              <w:rPr>
+                <w:rFonts w:cs="Arial"/>
+                <w:b/>
+                <w:szCs w:val="32"/>
+              </w:rPr>
+              <w:t xml:space="preserve">. - </w:t>
+            </w:r>
+            <w:r>
+              <w:rPr>
+                <w:rFonts w:cs="Arial"/>
+                <w:b/>
+                <w:sz w:val="28"/>
+                <w:szCs w:val="28"/>
+              </w:rPr>
+              <w:t>12</w:t>
+            </w:r>
+          </w:p>
+        </w:tc>
+        <w:tc>
+          <w:tcPr>
+            <w:tcW w:w="5103" w:type="dxa"/>
+          </w:tcPr>
+          <w:p>
+            <w:pPr>
+              <w:widowControl w:val="0"/>
+              <w:autoSpaceDE w:val="0"/>
+              <w:autoSpaceDN w:val="0"/>
+              <w:adjustRightInd w:val="0"/>
+              <w:spacing w:before="0" w:line="240" w:lineRule="auto"/>
+              <w:ind w:right="-136"/>
+              <w:rPr>
+                <w:rFonts w:ascii="BRH Devanagari Extra" w:hAnsi="BRH Devanagari Extra" w:cs="BRH Devanagari Extra"/>
+                <w:color w:val="000000"/>
+                <w:sz w:val="40"/>
+                <w:szCs w:val="40"/>
+              </w:rPr>
+            </w:pPr>
+            <w:r>
+              <w:rPr>
+                <w:rFonts w:ascii="BRH Devanagari Extra" w:hAnsi="BRH Devanagari Extra" w:cs="BRH Devanagari Extra"/>
+                <w:sz w:val="40"/>
+                <w:szCs w:val="40"/>
+              </w:rPr>
+              <w:t>eÉ</w:t>
+            </w:r>
+            <w:r>
+              <w:rPr>
+                <w:rFonts w:ascii="BRH Malayalam Extra" w:hAnsi="BRH Malayalam Extra" w:cs="BRH Devanagari Extra"/>
+                <w:sz w:val="30"/>
+                <w:szCs w:val="40"/>
+              </w:rPr>
+              <w:t>–</w:t>
+            </w:r>
+            <w:proofErr w:type="spellStart"/>
+            <w:r>
+              <w:rPr>
+                <w:rFonts w:ascii="BRH Devanagari Extra" w:hAnsi="BRH Devanagari Extra" w:cs="BRH Devanagari Extra"/>
+                <w:sz w:val="40"/>
+                <w:szCs w:val="40"/>
+              </w:rPr>
+              <w:t>liÉuÉ</w:t>
+            </w:r>
+            <w:proofErr w:type="spellEnd"/>
+            <w:r>
+              <w:rPr>
+                <w:rFonts w:ascii="BRH Malayalam Extra" w:hAnsi="BRH Malayalam Extra" w:cs="BRH Devanagari Extra"/>
+                <w:sz w:val="30"/>
+                <w:szCs w:val="40"/>
+              </w:rPr>
+              <w:t>–</w:t>
+            </w:r>
+            <w:r>
+              <w:rPr>
+                <w:rFonts w:ascii="BRH Devanagari Extra" w:hAnsi="BRH Devanagari Extra" w:cs="BRH Devanagari Extra"/>
+                <w:sz w:val="40"/>
+                <w:szCs w:val="40"/>
+              </w:rPr>
+              <w:t xml:space="preserve"> </w:t>
+            </w:r>
+            <w:proofErr w:type="spellStart"/>
+            <w:r>
+              <w:rPr>
+                <w:rFonts w:ascii="BRH Devanagari Extra" w:hAnsi="BRH Devanagari Extra" w:cs="BRH Devanagari Extra"/>
+                <w:sz w:val="40"/>
+                <w:szCs w:val="40"/>
+              </w:rPr>
+              <w:t>CÌiÉþ</w:t>
+            </w:r>
+            <w:proofErr w:type="spellEnd"/>
+            <w:r>
+              <w:rPr>
+                <w:rFonts w:ascii="BRH Devanagari Extra" w:hAnsi="BRH Devanagari Extra" w:cs="BRH Devanagari Extra"/>
+                <w:sz w:val="40"/>
+                <w:szCs w:val="40"/>
+              </w:rPr>
+              <w:t xml:space="preserve"> eÉ</w:t>
+            </w:r>
+            <w:r>
+              <w:rPr>
+                <w:rFonts w:ascii="BRH Malayalam Extra" w:hAnsi="BRH Malayalam Extra" w:cs="BRH Devanagari Extra"/>
+                <w:sz w:val="30"/>
+                <w:szCs w:val="40"/>
+              </w:rPr>
+              <w:t>–</w:t>
+            </w:r>
+            <w:proofErr w:type="spellStart"/>
+            <w:r>
+              <w:rPr>
+                <w:rFonts w:ascii="BRH Devanagari Extra" w:hAnsi="BRH Devanagari Extra" w:cs="BRH Devanagari Extra"/>
+                <w:sz w:val="40"/>
+                <w:szCs w:val="40"/>
+              </w:rPr>
+              <w:t>liÉuÉþÈ</w:t>
+            </w:r>
+            <w:proofErr w:type="spellEnd"/>
+            <w:r>
+              <w:rPr>
+                <w:rFonts w:ascii="BRH Devanagari Extra" w:hAnsi="BRH Devanagari Extra" w:cs="BRH Devanagari Extra"/>
+                <w:sz w:val="40"/>
+                <w:szCs w:val="40"/>
+              </w:rPr>
+              <w:t xml:space="preserve"> || </w:t>
+            </w:r>
+            <w:r>
+              <w:rPr>
+                <w:rFonts w:ascii="BRH Devanagari Extra" w:hAnsi="BRH Devanagari Extra" w:cs="BRH Devanagari Extra"/>
+                <w:sz w:val="40"/>
+                <w:szCs w:val="40"/>
+              </w:rPr>
+              <w:br/>
+            </w:r>
+            <w:proofErr w:type="spellStart"/>
+            <w:r>
+              <w:rPr>
+                <w:rFonts w:ascii="BRH Devanagari Extra" w:hAnsi="BRH Devanagari Extra" w:cs="BRH Devanagari Extra"/>
+                <w:sz w:val="40"/>
+                <w:szCs w:val="40"/>
+              </w:rPr>
+              <w:t>zÉÉå</w:t>
+            </w:r>
+            <w:proofErr w:type="spellEnd"/>
+            <w:r>
+              <w:rPr>
+                <w:rFonts w:ascii="BRH Malayalam Extra" w:hAnsi="BRH Malayalam Extra" w:cs="BRH Devanagari Extra"/>
+                <w:sz w:val="30"/>
+                <w:szCs w:val="40"/>
+              </w:rPr>
+              <w:t>–</w:t>
+            </w:r>
+            <w:proofErr w:type="spellStart"/>
+            <w:r>
+              <w:rPr>
+                <w:rFonts w:ascii="BRH Devanagari Extra" w:hAnsi="BRH Devanagari Extra" w:cs="BRH Devanagari Extra"/>
+                <w:sz w:val="40"/>
+                <w:szCs w:val="40"/>
+              </w:rPr>
+              <w:t>ÍcÉwMåüþzÉqÉç</w:t>
+            </w:r>
+            <w:proofErr w:type="spellEnd"/>
+            <w:r>
+              <w:rPr>
+                <w:rFonts w:ascii="BRH Devanagari Extra" w:hAnsi="BRH Devanagari Extra" w:cs="BRH Devanagari Extra"/>
+                <w:sz w:val="40"/>
+                <w:szCs w:val="40"/>
+              </w:rPr>
+              <w:t xml:space="preserve"> </w:t>
+            </w:r>
+            <w:proofErr w:type="spellStart"/>
+            <w:r>
+              <w:rPr>
+                <w:rFonts w:ascii="BRH Devanagari Extra" w:hAnsi="BRH Devanagari Extra" w:cs="BRH Devanagari Extra"/>
+                <w:sz w:val="40"/>
+                <w:szCs w:val="40"/>
+              </w:rPr>
+              <w:t>mÉÑÂ</w:t>
+            </w:r>
+            <w:r>
+              <w:rPr>
+                <w:rFonts w:ascii="BRH Devanagari Extra" w:hAnsi="BRH Devanagari Extra" w:cs="BRH Devanagari Extra"/>
+                <w:sz w:val="40"/>
+                <w:szCs w:val="40"/>
+                <w:highlight w:val="yellow"/>
+              </w:rPr>
+              <w:t>ÌmÉë</w:t>
+            </w:r>
+            <w:proofErr w:type="spellEnd"/>
+            <w:r>
+              <w:rPr>
+                <w:rFonts w:ascii="BRH Malayalam Extra" w:hAnsi="BRH Malayalam Extra" w:cs="BRH Devanagari Extra"/>
+                <w:sz w:val="30"/>
+                <w:szCs w:val="40"/>
+                <w:highlight w:val="yellow"/>
+              </w:rPr>
+              <w:t>–</w:t>
+            </w:r>
+            <w:r>
+              <w:rPr>
+                <w:rFonts w:ascii="BRH Devanagari Extra" w:hAnsi="BRH Devanagari Extra" w:cs="BRH Devanagari Extra"/>
+                <w:sz w:val="40"/>
+                <w:szCs w:val="40"/>
+              </w:rPr>
+              <w:t>rÉ |</w:t>
+            </w:r>
+          </w:p>
+        </w:tc>
+        <w:tc>
+          <w:tcPr>
+            <w:tcW w:w="5386" w:type="dxa"/>
+          </w:tcPr>
+          <w:p>
+            <w:pPr>
+              <w:widowControl w:val="0"/>
+              <w:autoSpaceDE w:val="0"/>
+              <w:autoSpaceDN w:val="0"/>
+              <w:adjustRightInd w:val="0"/>
+              <w:spacing w:line="252" w:lineRule="auto"/>
+              <w:ind w:right="-138"/>
+              <w:rPr>
+                <w:rFonts w:ascii="BRH Devanagari Extra" w:hAnsi="BRH Devanagari Extra" w:cs="BRH Devanagari Extra"/>
+                <w:color w:val="000000"/>
+                <w:sz w:val="40"/>
+                <w:szCs w:val="40"/>
+              </w:rPr>
+            </w:pPr>
+            <w:r>
+              <w:rPr>
+                <w:rFonts w:ascii="BRH Devanagari Extra" w:hAnsi="BRH Devanagari Extra" w:cs="BRH Devanagari Extra"/>
+                <w:sz w:val="40"/>
+                <w:szCs w:val="40"/>
+              </w:rPr>
+              <w:t>eÉ</w:t>
+            </w:r>
+            <w:r>
+              <w:rPr>
+                <w:rFonts w:ascii="BRH Malayalam Extra" w:hAnsi="BRH Malayalam Extra" w:cs="BRH Devanagari Extra"/>
+                <w:sz w:val="30"/>
+                <w:szCs w:val="40"/>
+              </w:rPr>
+              <w:t>–</w:t>
+            </w:r>
+            <w:proofErr w:type="spellStart"/>
+            <w:r>
+              <w:rPr>
+                <w:rFonts w:ascii="BRH Devanagari Extra" w:hAnsi="BRH Devanagari Extra" w:cs="BRH Devanagari Extra"/>
+                <w:sz w:val="40"/>
+                <w:szCs w:val="40"/>
+              </w:rPr>
+              <w:t>liÉuÉ</w:t>
+            </w:r>
+            <w:proofErr w:type="spellEnd"/>
+            <w:r>
+              <w:rPr>
+                <w:rFonts w:ascii="BRH Malayalam Extra" w:hAnsi="BRH Malayalam Extra" w:cs="BRH Devanagari Extra"/>
+                <w:sz w:val="30"/>
+                <w:szCs w:val="40"/>
+              </w:rPr>
+              <w:t>–</w:t>
+            </w:r>
+            <w:r>
+              <w:rPr>
+                <w:rFonts w:ascii="BRH Devanagari Extra" w:hAnsi="BRH Devanagari Extra" w:cs="BRH Devanagari Extra"/>
+                <w:sz w:val="40"/>
+                <w:szCs w:val="40"/>
+              </w:rPr>
+              <w:t xml:space="preserve"> </w:t>
+            </w:r>
+            <w:proofErr w:type="spellStart"/>
+            <w:r>
+              <w:rPr>
+                <w:rFonts w:ascii="BRH Devanagari Extra" w:hAnsi="BRH Devanagari Extra" w:cs="BRH Devanagari Extra"/>
+                <w:sz w:val="40"/>
+                <w:szCs w:val="40"/>
+              </w:rPr>
+              <w:t>CÌiÉþ</w:t>
+            </w:r>
+            <w:proofErr w:type="spellEnd"/>
+            <w:r>
+              <w:rPr>
+                <w:rFonts w:ascii="BRH Devanagari Extra" w:hAnsi="BRH Devanagari Extra" w:cs="BRH Devanagari Extra"/>
+                <w:sz w:val="40"/>
+                <w:szCs w:val="40"/>
+              </w:rPr>
+              <w:t xml:space="preserve"> eÉ</w:t>
+            </w:r>
+            <w:r>
+              <w:rPr>
+                <w:rFonts w:ascii="BRH Malayalam Extra" w:hAnsi="BRH Malayalam Extra" w:cs="BRH Devanagari Extra"/>
+                <w:sz w:val="30"/>
+                <w:szCs w:val="40"/>
+              </w:rPr>
+              <w:t>–</w:t>
+            </w:r>
+            <w:proofErr w:type="spellStart"/>
+            <w:r>
+              <w:rPr>
+                <w:rFonts w:ascii="BRH Devanagari Extra" w:hAnsi="BRH Devanagari Extra" w:cs="BRH Devanagari Extra"/>
+                <w:sz w:val="40"/>
+                <w:szCs w:val="40"/>
+              </w:rPr>
+              <w:t>liÉuÉþÈ</w:t>
+            </w:r>
+            <w:proofErr w:type="spellEnd"/>
+            <w:r>
+              <w:rPr>
+                <w:rFonts w:ascii="BRH Devanagari Extra" w:hAnsi="BRH Devanagari Extra" w:cs="BRH Devanagari Extra"/>
+                <w:sz w:val="40"/>
+                <w:szCs w:val="40"/>
+              </w:rPr>
+              <w:t xml:space="preserve"> || </w:t>
+            </w:r>
+            <w:r>
+              <w:rPr>
+                <w:rFonts w:ascii="BRH Devanagari Extra" w:hAnsi="BRH Devanagari Extra" w:cs="BRH Devanagari Extra"/>
+                <w:sz w:val="40"/>
+                <w:szCs w:val="40"/>
+              </w:rPr>
+              <w:br/>
+            </w:r>
+            <w:proofErr w:type="spellStart"/>
+            <w:r>
+              <w:rPr>
+                <w:rFonts w:ascii="BRH Devanagari Extra" w:hAnsi="BRH Devanagari Extra" w:cs="BRH Devanagari Extra"/>
+                <w:sz w:val="40"/>
+                <w:szCs w:val="40"/>
+              </w:rPr>
+              <w:t>zÉÉå</w:t>
+            </w:r>
+            <w:proofErr w:type="spellEnd"/>
+            <w:r>
+              <w:rPr>
+                <w:rFonts w:ascii="BRH Malayalam Extra" w:hAnsi="BRH Malayalam Extra" w:cs="BRH Devanagari Extra"/>
+                <w:sz w:val="30"/>
+                <w:szCs w:val="40"/>
+              </w:rPr>
+              <w:t>–</w:t>
+            </w:r>
+            <w:proofErr w:type="spellStart"/>
+            <w:r>
+              <w:rPr>
+                <w:rFonts w:ascii="BRH Devanagari Extra" w:hAnsi="BRH Devanagari Extra" w:cs="BRH Devanagari Extra"/>
+                <w:sz w:val="40"/>
+                <w:szCs w:val="40"/>
+              </w:rPr>
+              <w:t>ÍcÉwMåüþzÉqÉç</w:t>
+            </w:r>
+            <w:proofErr w:type="spellEnd"/>
+            <w:r>
+              <w:rPr>
+                <w:rFonts w:ascii="BRH Devanagari Extra" w:hAnsi="BRH Devanagari Extra" w:cs="BRH Devanagari Extra"/>
+                <w:sz w:val="40"/>
+                <w:szCs w:val="40"/>
+              </w:rPr>
+              <w:t xml:space="preserve"> </w:t>
+            </w:r>
+            <w:proofErr w:type="spellStart"/>
+            <w:r>
+              <w:rPr>
+                <w:rFonts w:ascii="BRH Devanagari Extra" w:hAnsi="BRH Devanagari Extra" w:cs="BRH Devanagari Extra"/>
+                <w:sz w:val="40"/>
+                <w:szCs w:val="40"/>
+              </w:rPr>
+              <w:t>mÉÑÂ</w:t>
+            </w:r>
+            <w:r>
+              <w:rPr>
+                <w:rFonts w:ascii="BRH Devanagari Extra" w:hAnsi="BRH Devanagari Extra" w:cs="BRH Devanagari Extra"/>
+                <w:sz w:val="40"/>
+                <w:szCs w:val="40"/>
+                <w:highlight w:val="green"/>
+              </w:rPr>
+              <w:t>ÌmÉ</w:t>
+            </w:r>
+            <w:r>
+              <w:rPr>
+                <w:rFonts w:ascii="BRH Devanagari Extra" w:hAnsi="BRH Devanagari Extra" w:cs="BRH Devanagari Extra"/>
+                <w:sz w:val="40"/>
+                <w:szCs w:val="40"/>
+                <w:highlight w:val="yellow"/>
+              </w:rPr>
+              <w:t>ë</w:t>
+            </w:r>
+            <w:r>
+              <w:rPr>
+                <w:rFonts w:ascii="BRH Devanagari Extra" w:hAnsi="BRH Devanagari Extra" w:cs="BRH Devanagari Extra"/>
+                <w:sz w:val="40"/>
+                <w:szCs w:val="40"/>
+              </w:rPr>
+              <w:t>rÉ</w:t>
+            </w:r>
+            <w:proofErr w:type="spellEnd"/>
+            <w:r>
+              <w:rPr>
+                <w:rFonts w:ascii="BRH Devanagari Extra" w:hAnsi="BRH Devanagari Extra" w:cs="BRH Devanagari Extra"/>
+                <w:sz w:val="40"/>
+                <w:szCs w:val="40"/>
+              </w:rPr>
+              <w:t xml:space="preserve"> |</w:t>
+            </w:r>
+          </w:p>
+        </w:tc>
+      </w:tr>
+      <w:tr>
+        <w:trPr>
+          <w:trHeight w:val="1671"/>
+        </w:trPr>
+        <w:tc>
+          <w:tcPr>
+            <w:tcW w:w="3906" w:type="dxa"/>
+          </w:tcPr>
+          <w:p>
+            <w:pPr>
+              <w:widowControl w:val="0"/>
+              <w:tabs>
+                <w:tab w:val="left" w:pos="993"/>
+              </w:tabs>
+              <w:autoSpaceDE w:val="0"/>
+              <w:autoSpaceDN w:val="0"/>
+              <w:adjustRightInd w:val="0"/>
+              <w:spacing w:before="0" w:line="252" w:lineRule="auto"/>
+              <w:ind w:right="297"/>
+              <w:rPr>
+                <w:rFonts w:cs="Arial"/>
+                <w:b/>
+                <w:sz w:val="28"/>
+                <w:szCs w:val="32"/>
+              </w:rPr>
+            </w:pPr>
+            <w:r>
+              <w:rPr>
+                <w:rFonts w:cs="Arial"/>
+                <w:b/>
+                <w:sz w:val="28"/>
+                <w:szCs w:val="32"/>
+              </w:rPr>
+              <w:t>T.S.4.4.4</w:t>
+            </w:r>
+            <w:r>
+              <w:rPr>
+                <w:rFonts w:cs="Arial"/>
+                <w:b/>
+                <w:sz w:val="28"/>
+                <w:szCs w:val="32"/>
+              </w:rPr>
+              <w:t>.</w:t>
+            </w:r>
+            <w:r>
+              <w:rPr>
+                <w:rFonts w:cs="Arial"/>
+                <w:b/>
+                <w:sz w:val="28"/>
+                <w:szCs w:val="32"/>
+              </w:rPr>
+              <w:t>5</w:t>
+            </w:r>
+            <w:r>
+              <w:rPr>
+                <w:rFonts w:cs="Arial"/>
+                <w:b/>
+                <w:sz w:val="28"/>
+                <w:szCs w:val="32"/>
+              </w:rPr>
+              <w:t xml:space="preserve"> – Kramam</w:t>
+            </w:r>
+          </w:p>
+          <w:p>
+            <w:pPr>
+              <w:widowControl w:val="0"/>
+              <w:tabs>
+                <w:tab w:val="left" w:pos="993"/>
+              </w:tabs>
+              <w:autoSpaceDE w:val="0"/>
+              <w:autoSpaceDN w:val="0"/>
+              <w:adjustRightInd w:val="0"/>
+              <w:spacing w:before="0" w:line="252" w:lineRule="auto"/>
+              <w:ind w:right="297"/>
+              <w:rPr>
+                <w:rFonts w:cs="Arial"/>
+                <w:b/>
+                <w:sz w:val="28"/>
+                <w:szCs w:val="32"/>
+              </w:rPr>
+            </w:pPr>
+            <w:r>
+              <w:rPr>
+                <w:rFonts w:cs="Arial"/>
+                <w:b/>
+                <w:sz w:val="28"/>
+                <w:szCs w:val="32"/>
+              </w:rPr>
+              <w:t xml:space="preserve">Krama Vaakyam No.– </w:t>
+            </w:r>
+            <w:r>
+              <w:rPr>
+                <w:rFonts w:cs="Arial"/>
+                <w:b/>
+                <w:sz w:val="28"/>
+                <w:szCs w:val="32"/>
+              </w:rPr>
+              <w:t>45</w:t>
+            </w:r>
+          </w:p>
+          <w:p>
+            <w:pPr>
+              <w:widowControl w:val="0"/>
+              <w:tabs>
+                <w:tab w:val="left" w:pos="993"/>
+              </w:tabs>
+              <w:autoSpaceDE w:val="0"/>
+              <w:autoSpaceDN w:val="0"/>
+              <w:adjustRightInd w:val="0"/>
+              <w:spacing w:before="0" w:line="252" w:lineRule="auto"/>
+              <w:ind w:right="297"/>
+              <w:rPr>
+                <w:rFonts w:cs="Arial"/>
+                <w:b/>
+                <w:sz w:val="28"/>
+                <w:szCs w:val="32"/>
+              </w:rPr>
+            </w:pPr>
+            <w:r>
+              <w:rPr>
+                <w:rFonts w:cs="Arial"/>
+                <w:b/>
+                <w:sz w:val="28"/>
+                <w:szCs w:val="32"/>
+              </w:rPr>
+              <w:t>Panchaati No</w:t>
+            </w:r>
+            <w:r>
+              <w:rPr>
+                <w:rFonts w:cs="Arial"/>
+                <w:b/>
+                <w:szCs w:val="32"/>
+              </w:rPr>
+              <w:t xml:space="preserve">. - </w:t>
+            </w:r>
+            <w:r>
+              <w:rPr>
+                <w:rFonts w:cs="Arial"/>
+                <w:b/>
+                <w:sz w:val="28"/>
+                <w:szCs w:val="28"/>
+              </w:rPr>
+              <w:t>1</w:t>
+            </w:r>
+            <w:r>
+              <w:rPr>
+                <w:rFonts w:cs="Arial"/>
+                <w:b/>
+                <w:sz w:val="28"/>
+                <w:szCs w:val="28"/>
+              </w:rPr>
+              <w:t>4</w:t>
+            </w:r>
+          </w:p>
+        </w:tc>
+        <w:tc>
+          <w:tcPr>
+            <w:tcW w:w="5103" w:type="dxa"/>
+          </w:tcPr>
+          <w:p>
+            <w:pPr>
+              <w:widowControl w:val="0"/>
+              <w:autoSpaceDE w:val="0"/>
+              <w:autoSpaceDN w:val="0"/>
+              <w:adjustRightInd w:val="0"/>
+              <w:spacing w:before="0" w:line="240" w:lineRule="auto"/>
+              <w:ind w:right="-136"/>
+              <w:rPr>
+                <w:rFonts w:ascii="BRH Devanagari Extra" w:hAnsi="BRH Devanagari Extra" w:cs="BRH Devanagari Extra"/>
+                <w:sz w:val="40"/>
+                <w:szCs w:val="40"/>
+              </w:rPr>
+            </w:pPr>
+            <w:proofErr w:type="spellStart"/>
+            <w:r>
+              <w:rPr>
+                <w:rFonts w:ascii="BRH Devanagari Extra" w:hAnsi="BRH Devanagari Extra" w:cs="BRH Devanagari Extra"/>
+                <w:color w:val="000000"/>
+                <w:sz w:val="40"/>
+                <w:szCs w:val="40"/>
+              </w:rPr>
+              <w:t>qÉÏ</w:t>
+            </w:r>
+            <w:proofErr w:type="spellEnd"/>
+            <w:r>
+              <w:rPr>
+                <w:rFonts w:ascii="BRH Malayalam Extra" w:hAnsi="BRH Malayalam Extra" w:cs="BRH Devanagari Extra"/>
+                <w:color w:val="000000"/>
+                <w:sz w:val="30"/>
+                <w:szCs w:val="40"/>
+              </w:rPr>
+              <w:t>–</w:t>
+            </w:r>
+            <w:proofErr w:type="spellStart"/>
+            <w:r>
+              <w:rPr>
+                <w:rFonts w:ascii="BRH Devanagari Extra" w:hAnsi="BRH Devanagari Extra" w:cs="BRH Devanagari Extra"/>
+                <w:color w:val="000000"/>
+                <w:sz w:val="40"/>
+                <w:szCs w:val="40"/>
+              </w:rPr>
+              <w:t>RÒûwÉ</w:t>
+            </w:r>
+            <w:proofErr w:type="spellEnd"/>
+            <w:r>
+              <w:rPr>
+                <w:rFonts w:ascii="BRH Malayalam Extra" w:hAnsi="BRH Malayalam Extra" w:cs="BRH Devanagari Extra"/>
+                <w:color w:val="000000"/>
+                <w:sz w:val="30"/>
+                <w:szCs w:val="40"/>
+              </w:rPr>
+              <w:t>–</w:t>
+            </w:r>
+            <w:r>
+              <w:rPr>
+                <w:rFonts w:ascii="BRH Devanagari Extra" w:hAnsi="BRH Devanagari Extra" w:cs="BRH Devanagari Extra"/>
+                <w:color w:val="000000"/>
+                <w:sz w:val="40"/>
+                <w:szCs w:val="40"/>
+              </w:rPr>
+              <w:t xml:space="preserve"> </w:t>
+            </w:r>
+            <w:proofErr w:type="spellStart"/>
+            <w:r>
+              <w:rPr>
+                <w:rFonts w:ascii="BRH Devanagari Extra" w:hAnsi="BRH Devanagari Extra" w:cs="BRH Devanagari Extra"/>
+                <w:color w:val="000000"/>
+                <w:sz w:val="40"/>
+                <w:szCs w:val="40"/>
+              </w:rPr>
+              <w:t>CÌiÉþ</w:t>
+            </w:r>
+            <w:proofErr w:type="spellEnd"/>
+            <w:r>
+              <w:rPr>
+                <w:rFonts w:ascii="BRH Devanagari Extra" w:hAnsi="BRH Devanagari Extra" w:cs="BRH Devanagari Extra"/>
+                <w:color w:val="000000"/>
+                <w:sz w:val="40"/>
+                <w:szCs w:val="40"/>
+              </w:rPr>
+              <w:t xml:space="preserve"> </w:t>
+            </w:r>
+            <w:proofErr w:type="spellStart"/>
+            <w:r>
+              <w:rPr>
+                <w:rFonts w:ascii="BRH Devanagari Extra" w:hAnsi="BRH Devanagari Extra" w:cs="BRH Devanagari Extra"/>
+                <w:sz w:val="40"/>
+                <w:szCs w:val="40"/>
+                <w:highlight w:val="yellow"/>
+              </w:rPr>
+              <w:t>Ì</w:t>
+            </w:r>
+            <w:r>
+              <w:rPr>
+                <w:rFonts w:ascii="BRH Devanagari Extra" w:hAnsi="BRH Devanagari Extra" w:cs="BRH Devanagari Extra"/>
+                <w:color w:val="000000"/>
+                <w:sz w:val="40"/>
+                <w:szCs w:val="40"/>
+                <w:highlight w:val="yellow"/>
+              </w:rPr>
+              <w:t>qÉ</w:t>
+            </w:r>
+            <w:proofErr w:type="spellEnd"/>
+            <w:r>
+              <w:rPr>
+                <w:rFonts w:ascii="BRH Malayalam Extra" w:hAnsi="BRH Malayalam Extra" w:cs="BRH Devanagari Extra"/>
+                <w:color w:val="000000"/>
+                <w:sz w:val="30"/>
+                <w:szCs w:val="40"/>
+                <w:highlight w:val="yellow"/>
+              </w:rPr>
+              <w:t>–</w:t>
+            </w:r>
+            <w:proofErr w:type="spellStart"/>
+            <w:r>
+              <w:rPr>
+                <w:rFonts w:ascii="BRH Devanagari Extra" w:hAnsi="BRH Devanagari Extra" w:cs="BRH Devanagari Extra"/>
+                <w:color w:val="000000"/>
+                <w:sz w:val="40"/>
+                <w:szCs w:val="40"/>
+              </w:rPr>
+              <w:t>RÒûwÉþÈ</w:t>
+            </w:r>
+            <w:proofErr w:type="spellEnd"/>
+            <w:r>
+              <w:rPr>
+                <w:rFonts w:ascii="BRH Devanagari Extra" w:hAnsi="BRH Devanagari Extra" w:cs="BRH Devanagari Extra"/>
+                <w:color w:val="000000"/>
+                <w:sz w:val="40"/>
+                <w:szCs w:val="40"/>
+              </w:rPr>
+              <w:t xml:space="preserve"> || </w:t>
+            </w:r>
+            <w:proofErr w:type="spellStart"/>
+            <w:r>
+              <w:rPr>
+                <w:rFonts w:ascii="BRH Devanagari Extra" w:hAnsi="BRH Devanagari Extra" w:cs="BRH Devanagari Extra"/>
+                <w:color w:val="000000"/>
+                <w:sz w:val="40"/>
+                <w:szCs w:val="40"/>
+              </w:rPr>
+              <w:t>ESè</w:t>
+            </w:r>
+            <w:proofErr w:type="spellEnd"/>
+            <w:r>
+              <w:rPr>
+                <w:rFonts w:ascii="BRH Devanagari Extra" w:hAnsi="BRH Devanagari Extra" w:cs="BRH Devanagari Extra"/>
+                <w:color w:val="000000"/>
+                <w:sz w:val="40"/>
+                <w:szCs w:val="40"/>
+              </w:rPr>
+              <w:t xml:space="preserve"> </w:t>
+            </w:r>
+            <w:proofErr w:type="spellStart"/>
+            <w:r>
+              <w:rPr>
+                <w:rFonts w:ascii="BRH Devanagari Extra" w:hAnsi="BRH Devanagari Extra" w:cs="BRH Devanagari Extra"/>
+                <w:color w:val="000000"/>
+                <w:sz w:val="40"/>
+                <w:szCs w:val="40"/>
+              </w:rPr>
+              <w:t>kÉÔ</w:t>
+            </w:r>
+            <w:proofErr w:type="spellEnd"/>
+            <w:r>
+              <w:rPr>
+                <w:rFonts w:ascii="BRH Malayalam Extra" w:hAnsi="BRH Malayalam Extra" w:cs="BRH Devanagari Extra"/>
+                <w:color w:val="000000"/>
+                <w:sz w:val="30"/>
+                <w:szCs w:val="40"/>
+              </w:rPr>
+              <w:t>–</w:t>
+            </w:r>
+            <w:proofErr w:type="spellStart"/>
+            <w:r>
+              <w:rPr>
+                <w:rFonts w:ascii="BRH Devanagari Extra" w:hAnsi="BRH Devanagari Extra" w:cs="BRH Devanagari Extra"/>
+                <w:color w:val="000000"/>
+                <w:sz w:val="40"/>
+                <w:szCs w:val="40"/>
+              </w:rPr>
+              <w:t>qÉÉxÉþÈ</w:t>
+            </w:r>
+            <w:proofErr w:type="spellEnd"/>
+            <w:r>
+              <w:rPr>
+                <w:rFonts w:ascii="BRH Devanagari Extra" w:hAnsi="BRH Devanagari Extra" w:cs="BRH Devanagari Extra"/>
+                <w:color w:val="000000"/>
+                <w:sz w:val="40"/>
+                <w:szCs w:val="40"/>
+              </w:rPr>
+              <w:t xml:space="preserve"> |</w:t>
+            </w:r>
+          </w:p>
+        </w:tc>
+        <w:tc>
+          <w:tcPr>
+            <w:tcW w:w="5386" w:type="dxa"/>
+          </w:tcPr>
+          <w:p>
+            <w:pPr>
+              <w:widowControl w:val="0"/>
+              <w:autoSpaceDE w:val="0"/>
+              <w:autoSpaceDN w:val="0"/>
+              <w:adjustRightInd w:val="0"/>
+              <w:spacing w:line="252" w:lineRule="auto"/>
+              <w:ind w:right="-138"/>
+              <w:rPr>
+                <w:rFonts w:ascii="BRH Devanagari Extra" w:hAnsi="BRH Devanagari Extra" w:cs="BRH Devanagari Extra"/>
+                <w:sz w:val="40"/>
+                <w:szCs w:val="40"/>
+              </w:rPr>
+            </w:pPr>
+            <w:proofErr w:type="spellStart"/>
+            <w:r>
+              <w:rPr>
+                <w:rFonts w:ascii="BRH Devanagari Extra" w:hAnsi="BRH Devanagari Extra" w:cs="BRH Devanagari Extra"/>
+                <w:color w:val="000000"/>
+                <w:sz w:val="40"/>
+                <w:szCs w:val="40"/>
+              </w:rPr>
+              <w:t>qÉÏ</w:t>
+            </w:r>
+            <w:proofErr w:type="spellEnd"/>
+            <w:r>
+              <w:rPr>
+                <w:rFonts w:ascii="BRH Malayalam Extra" w:hAnsi="BRH Malayalam Extra" w:cs="BRH Devanagari Extra"/>
+                <w:color w:val="000000"/>
+                <w:sz w:val="30"/>
+                <w:szCs w:val="40"/>
+              </w:rPr>
+              <w:t>–</w:t>
+            </w:r>
+            <w:proofErr w:type="spellStart"/>
+            <w:r>
+              <w:rPr>
+                <w:rFonts w:ascii="BRH Devanagari Extra" w:hAnsi="BRH Devanagari Extra" w:cs="BRH Devanagari Extra"/>
+                <w:color w:val="000000"/>
+                <w:sz w:val="40"/>
+                <w:szCs w:val="40"/>
+              </w:rPr>
+              <w:t>RÒûwÉ</w:t>
+            </w:r>
+            <w:proofErr w:type="spellEnd"/>
+            <w:r>
+              <w:rPr>
+                <w:rFonts w:ascii="BRH Malayalam Extra" w:hAnsi="BRH Malayalam Extra" w:cs="BRH Devanagari Extra"/>
+                <w:color w:val="000000"/>
+                <w:sz w:val="30"/>
+                <w:szCs w:val="40"/>
+              </w:rPr>
+              <w:t>–</w:t>
+            </w:r>
+            <w:r>
+              <w:rPr>
+                <w:rFonts w:ascii="BRH Devanagari Extra" w:hAnsi="BRH Devanagari Extra" w:cs="BRH Devanagari Extra"/>
+                <w:color w:val="000000"/>
+                <w:sz w:val="40"/>
+                <w:szCs w:val="40"/>
+              </w:rPr>
+              <w:t xml:space="preserve"> </w:t>
+            </w:r>
+            <w:proofErr w:type="spellStart"/>
+            <w:r>
+              <w:rPr>
+                <w:rFonts w:ascii="BRH Devanagari Extra" w:hAnsi="BRH Devanagari Extra" w:cs="BRH Devanagari Extra"/>
+                <w:color w:val="000000"/>
+                <w:sz w:val="40"/>
+                <w:szCs w:val="40"/>
+              </w:rPr>
+              <w:t>CÌiÉþ</w:t>
+            </w:r>
+            <w:proofErr w:type="spellEnd"/>
+            <w:r>
+              <w:rPr>
+                <w:rFonts w:ascii="BRH Devanagari Extra" w:hAnsi="BRH Devanagari Extra" w:cs="BRH Devanagari Extra"/>
+                <w:color w:val="000000"/>
+                <w:sz w:val="40"/>
+                <w:szCs w:val="40"/>
+              </w:rPr>
+              <w:t xml:space="preserve"> </w:t>
+            </w:r>
+            <w:proofErr w:type="spellStart"/>
+            <w:r>
+              <w:rPr>
+                <w:rFonts w:ascii="BRH Devanagari Extra" w:hAnsi="BRH Devanagari Extra" w:cs="BRH Devanagari Extra"/>
+                <w:color w:val="000000"/>
+                <w:sz w:val="40"/>
+                <w:szCs w:val="40"/>
+                <w:highlight w:val="green"/>
+              </w:rPr>
+              <w:t>qÉÏ</w:t>
+            </w:r>
+            <w:proofErr w:type="spellEnd"/>
+            <w:r>
+              <w:rPr>
+                <w:rFonts w:ascii="BRH Malayalam Extra" w:hAnsi="BRH Malayalam Extra" w:cs="BRH Devanagari Extra"/>
+                <w:color w:val="000000"/>
+                <w:sz w:val="30"/>
+                <w:szCs w:val="40"/>
+              </w:rPr>
+              <w:t>–</w:t>
+            </w:r>
+            <w:proofErr w:type="spellStart"/>
+            <w:r>
+              <w:rPr>
+                <w:rFonts w:ascii="BRH Devanagari Extra" w:hAnsi="BRH Devanagari Extra" w:cs="BRH Devanagari Extra"/>
+                <w:color w:val="000000"/>
+                <w:sz w:val="40"/>
+                <w:szCs w:val="40"/>
+              </w:rPr>
+              <w:t>RÒûwÉþÈ</w:t>
+            </w:r>
+            <w:proofErr w:type="spellEnd"/>
+            <w:r>
+              <w:rPr>
+                <w:rFonts w:ascii="BRH Devanagari Extra" w:hAnsi="BRH Devanagari Extra" w:cs="BRH Devanagari Extra"/>
+                <w:color w:val="000000"/>
+                <w:sz w:val="40"/>
+                <w:szCs w:val="40"/>
+              </w:rPr>
+              <w:t xml:space="preserve"> || </w:t>
+            </w:r>
+            <w:proofErr w:type="spellStart"/>
+            <w:r>
+              <w:rPr>
+                <w:rFonts w:ascii="BRH Devanagari Extra" w:hAnsi="BRH Devanagari Extra" w:cs="BRH Devanagari Extra"/>
+                <w:color w:val="000000"/>
+                <w:sz w:val="40"/>
+                <w:szCs w:val="40"/>
+              </w:rPr>
+              <w:t>ESè</w:t>
+            </w:r>
+            <w:proofErr w:type="spellEnd"/>
+            <w:r>
+              <w:rPr>
+                <w:rFonts w:ascii="BRH Devanagari Extra" w:hAnsi="BRH Devanagari Extra" w:cs="BRH Devanagari Extra"/>
+                <w:color w:val="000000"/>
+                <w:sz w:val="40"/>
+                <w:szCs w:val="40"/>
+              </w:rPr>
+              <w:t xml:space="preserve"> </w:t>
+            </w:r>
+            <w:proofErr w:type="spellStart"/>
+            <w:r>
+              <w:rPr>
+                <w:rFonts w:ascii="BRH Devanagari Extra" w:hAnsi="BRH Devanagari Extra" w:cs="BRH Devanagari Extra"/>
+                <w:color w:val="000000"/>
+                <w:sz w:val="40"/>
+                <w:szCs w:val="40"/>
+              </w:rPr>
+              <w:t>kÉÔ</w:t>
+            </w:r>
+            <w:proofErr w:type="spellEnd"/>
+            <w:r>
+              <w:rPr>
+                <w:rFonts w:ascii="BRH Malayalam Extra" w:hAnsi="BRH Malayalam Extra" w:cs="BRH Devanagari Extra"/>
+                <w:color w:val="000000"/>
+                <w:sz w:val="30"/>
+                <w:szCs w:val="40"/>
+              </w:rPr>
+              <w:t>–</w:t>
+            </w:r>
+            <w:proofErr w:type="spellStart"/>
+            <w:r>
+              <w:rPr>
+                <w:rFonts w:ascii="BRH Devanagari Extra" w:hAnsi="BRH Devanagari Extra" w:cs="BRH Devanagari Extra"/>
+                <w:color w:val="000000"/>
+                <w:sz w:val="40"/>
+                <w:szCs w:val="40"/>
+              </w:rPr>
+              <w:t>qÉÉxÉþÈ</w:t>
+            </w:r>
+            <w:proofErr w:type="spellEnd"/>
+            <w:r>
+              <w:rPr>
+                <w:rFonts w:ascii="BRH Devanagari Extra" w:hAnsi="BRH Devanagari Extra" w:cs="BRH Devanagari Extra"/>
+                <w:color w:val="000000"/>
+                <w:sz w:val="40"/>
+                <w:szCs w:val="40"/>
+              </w:rPr>
+              <w:t xml:space="preserve"> |</w:t>
+            </w:r>
+          </w:p>
+        </w:tc>
+      </w:tr>
+    </w:tbl>
+    <w:p>
+      <w:pPr>
+        <w:jc w:val="center"/>
+        <w:rPr>
+          <w:b/>
+          <w:bCs/>
+          <w:sz w:val="32"/>
+          <w:szCs w:val="32"/>
+          <w:u w:val="single"/>
+        </w:rPr>
+      </w:pPr>
+      <w:r>
+        <w:rPr>
+          <w:b/>
+          <w:bCs/>
+          <w:sz w:val="32"/>
+          <w:szCs w:val="32"/>
+          <w:u w:val="single"/>
+        </w:rPr>
+        <w:t>==================</w:t>
+      </w:r>
+    </w:p>
     <w:p>
       <w:pPr>
         <w:jc w:val="center"/>
@@ -23,7 +1356,6 @@
         </w:rPr>
         <w:t xml:space="preserve">TS </w:t>
       </w:r>
-      <w:proofErr w:type="spellStart"/>
       <w:r>
         <w:rPr>
           <w:b/>
@@ -34,7 +1366,6 @@
         </w:rPr>
         <w:t>Krama</w:t>
       </w:r>
-      <w:proofErr w:type="spellEnd"/>
       <w:r>
         <w:rPr>
           <w:b/>
@@ -43,29 +1374,7 @@
           <w:szCs w:val="32"/>
           <w:u w:val="single"/>
         </w:rPr>
-        <w:t xml:space="preserve"> </w:t>
-      </w:r>
-      <w:proofErr w:type="spellStart"/>
-      <w:r>
-        <w:rPr>
-          <w:b/>
-          <w:bCs/>
-          <w:sz w:val="32"/>
-          <w:szCs w:val="32"/>
-          <w:u w:val="single"/>
-        </w:rPr>
-        <w:t>Paatam</w:t>
-      </w:r>
-      <w:proofErr w:type="spellEnd"/>
-      <w:r>
-        <w:rPr>
-          <w:b/>
-          <w:bCs/>
-          <w:sz w:val="32"/>
-          <w:szCs w:val="32"/>
-          <w:u w:val="single"/>
-        </w:rPr>
-        <w:t xml:space="preserve"> – TS </w:t>
+        <w:t xml:space="preserve"> Paatam – TS </w:t>
       </w:r>
       <w:r>
         <w:rPr>
@@ -164,12 +1473,16 @@
               <w:spacing w:before="0" w:line="240" w:lineRule="auto"/>
               <w:jc w:val="center"/>
               <w:rPr>
+                <w:b/>
+                <w:bCs/>
                 <w:sz w:val="32"/>
                 <w:szCs w:val="32"/>
               </w:rPr>
             </w:pPr>
             <w:r>
               <w:rPr>
+                <w:b/>
+                <w:bCs/>
                 <w:sz w:val="32"/>
                 <w:szCs w:val="32"/>
               </w:rPr>
@@ -181,12 +1494,16 @@
               <w:spacing w:before="0" w:line="240" w:lineRule="auto"/>
               <w:jc w:val="center"/>
               <w:rPr>
+                <w:b/>
+                <w:bCs/>
                 <w:sz w:val="32"/>
                 <w:szCs w:val="32"/>
               </w:rPr>
             </w:pPr>
             <w:r>
               <w:rPr>
+                <w:b/>
+                <w:bCs/>
                 <w:sz w:val="32"/>
                 <w:szCs w:val="32"/>
               </w:rPr>
@@ -203,12 +1520,16 @@
               <w:spacing w:before="0" w:line="240" w:lineRule="auto"/>
               <w:jc w:val="center"/>
               <w:rPr>
+                <w:b/>
+                <w:bCs/>
                 <w:sz w:val="32"/>
                 <w:szCs w:val="32"/>
               </w:rPr>
             </w:pPr>
             <w:r>
               <w:rPr>
+                <w:b/>
+                <w:bCs/>
                 <w:sz w:val="32"/>
                 <w:szCs w:val="32"/>
               </w:rPr>
@@ -226,12 +1547,16 @@
               <w:ind w:right="-18"/>
               <w:jc w:val="center"/>
               <w:rPr>
+                <w:b/>
+                <w:bCs/>
                 <w:sz w:val="32"/>
                 <w:szCs w:val="32"/>
               </w:rPr>
             </w:pPr>
             <w:r>
               <w:rPr>
+                <w:b/>
+                <w:bCs/>
                 <w:sz w:val="32"/>
                 <w:szCs w:val="32"/>
               </w:rPr>
@@ -282,19 +1607,8 @@
                 <w:sz w:val="28"/>
                 <w:szCs w:val="32"/>
               </w:rPr>
-              <w:t xml:space="preserve">.1 – </w:t>
-            </w:r>
-            <w:proofErr w:type="spellStart"/>
-            <w:r>
-              <w:rPr>
-                <w:rFonts w:cs="Arial"/>
-                <w:b/>
-                <w:sz w:val="28"/>
-                <w:szCs w:val="32"/>
-              </w:rPr>
-              <w:t>Kramam</w:t>
-            </w:r>
-            <w:proofErr w:type="spellEnd"/>
+              <w:t>.1 – Kramam</w:t>
+            </w:r>
           </w:p>
           <w:p>
             <w:pPr>
@@ -314,45 +1628,14 @@
                 <w:szCs w:val="32"/>
               </w:rPr>
             </w:pPr>
-            <w:proofErr w:type="spellStart"/>
-            <w:r>
-              <w:rPr>
-                <w:rFonts w:cs="Arial"/>
-                <w:b/>
-                <w:sz w:val="28"/>
-                <w:szCs w:val="32"/>
-              </w:rPr>
-              <w:t>Krama</w:t>
-            </w:r>
-            <w:proofErr w:type="spellEnd"/>
-            <w:r>
-              <w:rPr>
-                <w:rFonts w:cs="Arial"/>
-                <w:b/>
-                <w:sz w:val="28"/>
-                <w:szCs w:val="32"/>
-              </w:rPr>
-              <w:t xml:space="preserve"> </w:t>
-            </w:r>
-            <w:proofErr w:type="spellStart"/>
-            <w:r>
-              <w:rPr>
-                <w:rFonts w:cs="Arial"/>
-                <w:b/>
-                <w:sz w:val="28"/>
-                <w:szCs w:val="32"/>
-              </w:rPr>
-              <w:t>Vaakyam</w:t>
-            </w:r>
-            <w:proofErr w:type="spellEnd"/>
-            <w:r>
-              <w:rPr>
-                <w:rFonts w:cs="Arial"/>
-                <w:b/>
-                <w:sz w:val="28"/>
-                <w:szCs w:val="32"/>
-              </w:rPr>
-              <w:t xml:space="preserve"> No.– </w:t>
+            <w:r>
+              <w:rPr>
+                <w:rFonts w:cs="Arial"/>
+                <w:b/>
+                <w:sz w:val="28"/>
+                <w:szCs w:val="32"/>
+              </w:rPr>
+              <w:t xml:space="preserve">Krama Vaakyam No.– </w:t>
             </w:r>
             <w:r>
               <w:rPr>
@@ -382,25 +1665,14 @@
                 <w:szCs w:val="32"/>
               </w:rPr>
             </w:pPr>
-            <w:proofErr w:type="spellStart"/>
-            <w:r>
-              <w:rPr>
-                <w:rFonts w:cs="Arial"/>
-                <w:b/>
-                <w:sz w:val="28"/>
-                <w:szCs w:val="32"/>
-              </w:rPr>
-              <w:t>Panchaati</w:t>
-            </w:r>
-            <w:proofErr w:type="spellEnd"/>
-            <w:r>
-              <w:rPr>
-                <w:rFonts w:cs="Arial"/>
-                <w:b/>
-                <w:sz w:val="28"/>
-                <w:szCs w:val="32"/>
-              </w:rPr>
-              <w:t xml:space="preserve"> No</w:t>
+            <w:r>
+              <w:rPr>
+                <w:rFonts w:cs="Arial"/>
+                <w:b/>
+                <w:sz w:val="28"/>
+                <w:szCs w:val="32"/>
+              </w:rPr>
+              <w:t>Panchaati No</w:t>
             </w:r>
             <w:r>
               <w:rPr>
@@ -911,6 +2183,7 @@
                 <w:sz w:val="28"/>
                 <w:szCs w:val="32"/>
               </w:rPr>
+              <w:lastRenderedPageBreak/>
               <w:t>T.S.4.4.6.2</w:t>
             </w:r>
             <w:r>
@@ -920,19 +2193,8 @@
                 <w:sz w:val="28"/>
                 <w:szCs w:val="32"/>
               </w:rPr>
-              <w:t xml:space="preserve"> – </w:t>
-            </w:r>
-            <w:proofErr w:type="spellStart"/>
-            <w:r>
-              <w:rPr>
-                <w:rFonts w:cs="Arial"/>
-                <w:b/>
-                <w:sz w:val="28"/>
-                <w:szCs w:val="32"/>
-              </w:rPr>
-              <w:t>Kramam</w:t>
-            </w:r>
-            <w:proofErr w:type="spellEnd"/>
+              <w:t xml:space="preserve"> – Kramam</w:t>
+            </w:r>
           </w:p>
           <w:p>
             <w:pPr>
@@ -952,45 +2214,14 @@
                 <w:szCs w:val="32"/>
               </w:rPr>
             </w:pPr>
-            <w:proofErr w:type="spellStart"/>
-            <w:r>
-              <w:rPr>
-                <w:rFonts w:cs="Arial"/>
-                <w:b/>
-                <w:sz w:val="28"/>
-                <w:szCs w:val="32"/>
-              </w:rPr>
-              <w:t>Krama</w:t>
-            </w:r>
-            <w:proofErr w:type="spellEnd"/>
-            <w:r>
-              <w:rPr>
-                <w:rFonts w:cs="Arial"/>
-                <w:b/>
-                <w:sz w:val="28"/>
-                <w:szCs w:val="32"/>
-              </w:rPr>
-              <w:t xml:space="preserve"> </w:t>
-            </w:r>
-            <w:proofErr w:type="spellStart"/>
-            <w:r>
-              <w:rPr>
-                <w:rFonts w:cs="Arial"/>
-                <w:b/>
-                <w:sz w:val="28"/>
-                <w:szCs w:val="32"/>
-              </w:rPr>
-              <w:t>Vaakyam</w:t>
-            </w:r>
-            <w:proofErr w:type="spellEnd"/>
-            <w:r>
-              <w:rPr>
-                <w:rFonts w:cs="Arial"/>
-                <w:b/>
-                <w:sz w:val="28"/>
-                <w:szCs w:val="32"/>
-              </w:rPr>
-              <w:t xml:space="preserve"> No.– </w:t>
+            <w:r>
+              <w:rPr>
+                <w:rFonts w:cs="Arial"/>
+                <w:b/>
+                <w:sz w:val="28"/>
+                <w:szCs w:val="32"/>
+              </w:rPr>
+              <w:t xml:space="preserve">Krama Vaakyam No.– </w:t>
             </w:r>
             <w:r>
               <w:rPr>
@@ -1020,25 +2251,14 @@
                 <w:szCs w:val="32"/>
               </w:rPr>
             </w:pPr>
-            <w:proofErr w:type="spellStart"/>
-            <w:r>
-              <w:rPr>
-                <w:rFonts w:cs="Arial"/>
-                <w:b/>
-                <w:sz w:val="28"/>
-                <w:szCs w:val="32"/>
-              </w:rPr>
-              <w:t>Panchaati</w:t>
-            </w:r>
-            <w:proofErr w:type="spellEnd"/>
-            <w:r>
-              <w:rPr>
-                <w:rFonts w:cs="Arial"/>
-                <w:b/>
-                <w:sz w:val="28"/>
-                <w:szCs w:val="32"/>
-              </w:rPr>
-              <w:t xml:space="preserve"> No</w:t>
+            <w:r>
+              <w:rPr>
+                <w:rFonts w:cs="Arial"/>
+                <w:b/>
+                <w:sz w:val="28"/>
+                <w:szCs w:val="32"/>
+              </w:rPr>
+              <w:t>Panchaati No</w:t>
             </w:r>
             <w:r>
               <w:rPr>
@@ -1387,19 +2607,8 @@
                 <w:sz w:val="28"/>
                 <w:szCs w:val="32"/>
               </w:rPr>
-              <w:t xml:space="preserve"> – </w:t>
-            </w:r>
-            <w:proofErr w:type="spellStart"/>
-            <w:r>
-              <w:rPr>
-                <w:rFonts w:cs="Arial"/>
-                <w:b/>
-                <w:sz w:val="28"/>
-                <w:szCs w:val="32"/>
-              </w:rPr>
-              <w:t>Kramam</w:t>
-            </w:r>
-            <w:proofErr w:type="spellEnd"/>
+              <w:t xml:space="preserve"> – Kramam</w:t>
+            </w:r>
           </w:p>
           <w:p>
             <w:pPr>
@@ -1419,45 +2628,14 @@
                 <w:szCs w:val="32"/>
               </w:rPr>
             </w:pPr>
-            <w:proofErr w:type="spellStart"/>
-            <w:r>
-              <w:rPr>
-                <w:rFonts w:cs="Arial"/>
-                <w:b/>
-                <w:sz w:val="28"/>
-                <w:szCs w:val="32"/>
-              </w:rPr>
-              <w:t>Krama</w:t>
-            </w:r>
-            <w:proofErr w:type="spellEnd"/>
-            <w:r>
-              <w:rPr>
-                <w:rFonts w:cs="Arial"/>
-                <w:b/>
-                <w:sz w:val="28"/>
-                <w:szCs w:val="32"/>
-              </w:rPr>
-              <w:t xml:space="preserve"> </w:t>
-            </w:r>
-            <w:proofErr w:type="spellStart"/>
-            <w:r>
-              <w:rPr>
-                <w:rFonts w:cs="Arial"/>
-                <w:b/>
-                <w:sz w:val="28"/>
-                <w:szCs w:val="32"/>
-              </w:rPr>
-              <w:t>Vaakyam</w:t>
-            </w:r>
-            <w:proofErr w:type="spellEnd"/>
-            <w:r>
-              <w:rPr>
-                <w:rFonts w:cs="Arial"/>
-                <w:b/>
-                <w:sz w:val="28"/>
-                <w:szCs w:val="32"/>
-              </w:rPr>
-              <w:t xml:space="preserve"> No.– </w:t>
+            <w:r>
+              <w:rPr>
+                <w:rFonts w:cs="Arial"/>
+                <w:b/>
+                <w:sz w:val="28"/>
+                <w:szCs w:val="32"/>
+              </w:rPr>
+              <w:t xml:space="preserve">Krama Vaakyam No.– </w:t>
             </w:r>
             <w:r>
               <w:rPr>
@@ -1487,25 +2665,14 @@
                 <w:szCs w:val="32"/>
               </w:rPr>
             </w:pPr>
-            <w:proofErr w:type="spellStart"/>
-            <w:r>
-              <w:rPr>
-                <w:rFonts w:cs="Arial"/>
-                <w:b/>
-                <w:sz w:val="28"/>
-                <w:szCs w:val="32"/>
-              </w:rPr>
-              <w:t>Panchaati</w:t>
-            </w:r>
-            <w:proofErr w:type="spellEnd"/>
-            <w:r>
-              <w:rPr>
-                <w:rFonts w:cs="Arial"/>
-                <w:b/>
-                <w:sz w:val="28"/>
-                <w:szCs w:val="32"/>
-              </w:rPr>
-              <w:t xml:space="preserve"> No</w:t>
+            <w:r>
+              <w:rPr>
+                <w:rFonts w:cs="Arial"/>
+                <w:b/>
+                <w:sz w:val="28"/>
+                <w:szCs w:val="32"/>
+              </w:rPr>
+              <w:t>Panchaati No</w:t>
             </w:r>
             <w:r>
               <w:rPr>
@@ -1589,7 +2756,6 @@
               </w:rPr>
               <w:t>–</w:t>
             </w:r>
-            <w:proofErr w:type="spellStart"/>
             <w:r>
               <w:rPr>
                 <w:rFonts w:ascii="BRH Devanagari Extra" w:hAnsi="BRH Devanagari Extra" w:cs="BRH Devanagari Extra"/>
@@ -1607,17 +2773,7 @@
                 <w:sz w:val="40"/>
                 <w:szCs w:val="40"/>
               </w:rPr>
-              <w:t>iÉåÌiÉþ</w:t>
-            </w:r>
-            <w:proofErr w:type="spellEnd"/>
-            <w:r>
-              <w:rPr>
-                <w:rFonts w:ascii="BRH Devanagari Extra" w:hAnsi="BRH Devanagari Extra" w:cs="BRH Devanagari Extra"/>
-                <w:color w:val="000000"/>
-                <w:sz w:val="40"/>
-                <w:szCs w:val="40"/>
-              </w:rPr>
-              <w:t xml:space="preserve"> </w:t>
+              <w:t xml:space="preserve">iÉåÌiÉþ </w:t>
             </w:r>
             <w:proofErr w:type="spellStart"/>
             <w:r>
@@ -1880,7 +3036,6 @@
         </w:rPr>
         <w:t xml:space="preserve">TS </w:t>
       </w:r>
-      <w:proofErr w:type="spellStart"/>
       <w:r>
         <w:rPr>
           <w:b/>
@@ -1891,7 +3046,6 @@
         </w:rPr>
         <w:t>Krama</w:t>
       </w:r>
-      <w:proofErr w:type="spellEnd"/>
       <w:r>
         <w:rPr>
           <w:b/>
@@ -1900,29 +3054,7 @@
           <w:szCs w:val="32"/>
           <w:u w:val="single"/>
         </w:rPr>
-        <w:t xml:space="preserve"> </w:t>
-      </w:r>
-      <w:proofErr w:type="spellStart"/>
-      <w:r>
-        <w:rPr>
-          <w:b/>
-          <w:bCs/>
-          <w:sz w:val="32"/>
-          <w:szCs w:val="32"/>
-          <w:u w:val="single"/>
-        </w:rPr>
-        <w:t>Paatam</w:t>
-      </w:r>
-      <w:proofErr w:type="spellEnd"/>
-      <w:r>
-        <w:rPr>
-          <w:b/>
-          <w:bCs/>
-          <w:sz w:val="32"/>
-          <w:szCs w:val="32"/>
-          <w:u w:val="single"/>
-        </w:rPr>
-        <w:t xml:space="preserve"> – TS </w:t>
+        <w:t xml:space="preserve"> Paatam – TS </w:t>
       </w:r>
       <w:r>
         <w:rPr>
@@ -2529,7 +3661,6 @@
                 <w:sz w:val="28"/>
                 <w:szCs w:val="32"/>
               </w:rPr>
-              <w:lastRenderedPageBreak/>
               <w:t>T.S.4.4.2.1 – Kramam</w:t>
             </w:r>
           </w:p>
@@ -2836,23 +3967,7 @@
                 <w:b/>
                 <w:bCs/>
               </w:rPr>
-              <w:t>(</w:t>
-            </w:r>
-            <w:proofErr w:type="spellStart"/>
-            <w:r>
-              <w:rPr>
-                <w:b/>
-                <w:bCs/>
-              </w:rPr>
-              <w:t>swara</w:t>
-            </w:r>
-            <w:proofErr w:type="spellEnd"/>
-            <w:r>
-              <w:rPr>
-                <w:b/>
-                <w:bCs/>
-              </w:rPr>
-              <w:t xml:space="preserve"> </w:t>
+              <w:t xml:space="preserve">(swara </w:t>
             </w:r>
             <w:proofErr w:type="spellStart"/>
             <w:r>
@@ -3480,6 +4595,7 @@
                 <w:sz w:val="28"/>
                 <w:szCs w:val="32"/>
               </w:rPr>
+              <w:lastRenderedPageBreak/>
               <w:t>T.S.4.4.2.3 – Kramam</w:t>
             </w:r>
           </w:p>
@@ -3650,25 +4766,14 @@
                 <w:szCs w:val="40"/>
               </w:rPr>
             </w:pPr>
-            <w:proofErr w:type="spellStart"/>
-            <w:r>
-              <w:rPr>
-                <w:rFonts w:ascii="BRH Devanagari Extra" w:hAnsi="BRH Devanagari Extra" w:cs="BRH Devanagari Extra"/>
-                <w:color w:val="000000"/>
-                <w:sz w:val="40"/>
-                <w:szCs w:val="40"/>
-              </w:rPr>
-              <w:t>mÉ</w:t>
-            </w:r>
-            <w:proofErr w:type="spellEnd"/>
-            <w:r>
-              <w:rPr>
-                <w:rFonts w:ascii="BRH Devanagari Extra" w:hAnsi="BRH Devanagari Extra" w:cs="BRH Devanagari Extra"/>
-                <w:color w:val="000000"/>
-                <w:sz w:val="40"/>
-                <w:szCs w:val="40"/>
-              </w:rPr>
-              <w:t>×</w:t>
+            <w:r>
+              <w:rPr>
+                <w:rFonts w:ascii="BRH Devanagari Extra" w:hAnsi="BRH Devanagari Extra" w:cs="BRH Devanagari Extra"/>
+                <w:color w:val="000000"/>
+                <w:sz w:val="40"/>
+                <w:szCs w:val="40"/>
+              </w:rPr>
+              <w:t>mÉ×</w:t>
             </w:r>
             <w:r>
               <w:rPr>
@@ -3844,25 +4949,14 @@
                 <w:szCs w:val="40"/>
               </w:rPr>
             </w:pPr>
-            <w:proofErr w:type="spellStart"/>
-            <w:r>
-              <w:rPr>
-                <w:rFonts w:ascii="BRH Devanagari Extra" w:hAnsi="BRH Devanagari Extra" w:cs="BRH Devanagari Extra"/>
-                <w:color w:val="000000"/>
-                <w:sz w:val="40"/>
-                <w:szCs w:val="40"/>
-              </w:rPr>
-              <w:t>mÉ</w:t>
-            </w:r>
-            <w:proofErr w:type="spellEnd"/>
-            <w:r>
-              <w:rPr>
-                <w:rFonts w:ascii="BRH Devanagari Extra" w:hAnsi="BRH Devanagari Extra" w:cs="BRH Devanagari Extra"/>
-                <w:color w:val="000000"/>
-                <w:sz w:val="40"/>
-                <w:szCs w:val="40"/>
-              </w:rPr>
-              <w:t>×</w:t>
+            <w:r>
+              <w:rPr>
+                <w:rFonts w:ascii="BRH Devanagari Extra" w:hAnsi="BRH Devanagari Extra" w:cs="BRH Devanagari Extra"/>
+                <w:color w:val="000000"/>
+                <w:sz w:val="40"/>
+                <w:szCs w:val="40"/>
+              </w:rPr>
+              <w:t>mÉ×</w:t>
             </w:r>
             <w:r>
               <w:rPr>
@@ -5255,19 +6349,8 @@
                 <w:sz w:val="40"/>
                 <w:szCs w:val="40"/>
               </w:rPr>
-              <w:t xml:space="preserve"> | </w:t>
-            </w:r>
-            <w:proofErr w:type="spellStart"/>
-            <w:r>
-              <w:rPr>
-                <w:rFonts w:ascii="BRH Devanagari Extra" w:hAnsi="BRH Devanagari Extra" w:cs="BRH Devanagari Extra"/>
-                <w:color w:val="000000"/>
-                <w:sz w:val="40"/>
-                <w:szCs w:val="40"/>
-              </w:rPr>
-              <w:t>rÉ</w:t>
-            </w:r>
-            <w:proofErr w:type="spellEnd"/>
+              <w:t xml:space="preserve"> | rÉ</w:t>
+            </w:r>
             <w:r>
               <w:rPr>
                 <w:rFonts w:ascii="BRH Malayalam Extra" w:hAnsi="BRH Malayalam Extra" w:cs="BRH Devanagari Extra"/>
@@ -5372,19 +6455,8 @@
                 <w:sz w:val="40"/>
                 <w:szCs w:val="40"/>
               </w:rPr>
-              <w:t xml:space="preserve"> | </w:t>
-            </w:r>
-            <w:proofErr w:type="spellStart"/>
-            <w:r>
-              <w:rPr>
-                <w:rFonts w:ascii="BRH Devanagari Extra" w:hAnsi="BRH Devanagari Extra" w:cs="BRH Devanagari Extra"/>
-                <w:color w:val="000000"/>
-                <w:sz w:val="40"/>
-                <w:szCs w:val="40"/>
-              </w:rPr>
-              <w:t>rÉ</w:t>
-            </w:r>
-            <w:proofErr w:type="spellEnd"/>
+              <w:t xml:space="preserve"> | rÉ</w:t>
+            </w:r>
             <w:r>
               <w:rPr>
                 <w:rFonts w:ascii="BRH Malayalam Extra" w:hAnsi="BRH Malayalam Extra" w:cs="BRH Devanagari Extra"/>
@@ -5480,7 +6552,6 @@
                 <w:sz w:val="28"/>
                 <w:szCs w:val="32"/>
               </w:rPr>
-              <w:lastRenderedPageBreak/>
               <w:t>T.S.4.4.4.2 – Kramam</w:t>
             </w:r>
           </w:p>
@@ -6099,7 +7170,6 @@
                 <w:lang w:val="en-IN" w:eastAsia="en-IN" w:bidi="ml-IN"/>
               </w:rPr>
             </w:pPr>
-            <w:proofErr w:type="spellStart"/>
             <w:r>
               <w:rPr>
                 <w:rFonts w:ascii="BRH Devanagari Extra" w:hAnsi="BRH Devanagari Extra" w:cs="BRH Devanagari Extra"/>
@@ -6109,7 +7179,6 @@
               </w:rPr>
               <w:t>xÉ</w:t>
             </w:r>
-            <w:proofErr w:type="spellEnd"/>
             <w:r>
               <w:rPr>
                 <w:rFonts w:ascii="BRH Malayalam Extra" w:hAnsi="BRH Malayalam Extra" w:cs="BRH Devanagari Extra"/>
@@ -6244,7 +7313,6 @@
                 <w:lang w:val="en-IN" w:eastAsia="en-IN" w:bidi="ml-IN"/>
               </w:rPr>
             </w:pPr>
-            <w:proofErr w:type="spellStart"/>
             <w:r>
               <w:rPr>
                 <w:rFonts w:ascii="BRH Devanagari Extra" w:hAnsi="BRH Devanagari Extra" w:cs="BRH Devanagari Extra"/>
@@ -6254,7 +7322,6 @@
               </w:rPr>
               <w:t>xÉ</w:t>
             </w:r>
-            <w:proofErr w:type="spellEnd"/>
             <w:r>
               <w:rPr>
                 <w:rFonts w:ascii="BRH Malayalam Extra" w:hAnsi="BRH Malayalam Extra" w:cs="BRH Devanagari Extra"/>
@@ -6417,6 +7484,7 @@
                 <w:sz w:val="28"/>
                 <w:szCs w:val="32"/>
               </w:rPr>
+              <w:lastRenderedPageBreak/>
               <w:t>T.S.4.4.4.6 – Kramam</w:t>
             </w:r>
           </w:p>
@@ -6891,19 +7959,8 @@
                 <w:sz w:val="40"/>
                 <w:szCs w:val="40"/>
               </w:rPr>
-              <w:t xml:space="preserve"> | </w:t>
-            </w:r>
-            <w:proofErr w:type="spellStart"/>
-            <w:r>
-              <w:rPr>
-                <w:rFonts w:ascii="BRH Devanagari Extra" w:hAnsi="BRH Devanagari Extra" w:cs="BRH Devanagari Extra"/>
-                <w:color w:val="000000"/>
-                <w:sz w:val="40"/>
-                <w:szCs w:val="40"/>
-              </w:rPr>
-              <w:t>pÉ</w:t>
-            </w:r>
-            <w:proofErr w:type="spellEnd"/>
+              <w:t xml:space="preserve"> | pÉ</w:t>
+            </w:r>
             <w:r>
               <w:rPr>
                 <w:rFonts w:ascii="BRH Malayalam Extra" w:hAnsi="BRH Malayalam Extra" w:cs="BRH Devanagari Extra"/>
@@ -7018,19 +8075,8 @@
                 <w:sz w:val="40"/>
                 <w:szCs w:val="40"/>
               </w:rPr>
-              <w:t xml:space="preserve"> | </w:t>
-            </w:r>
-            <w:proofErr w:type="spellStart"/>
-            <w:r>
-              <w:rPr>
-                <w:rFonts w:ascii="BRH Devanagari Extra" w:hAnsi="BRH Devanagari Extra" w:cs="BRH Devanagari Extra"/>
-                <w:color w:val="000000"/>
-                <w:sz w:val="40"/>
-                <w:szCs w:val="40"/>
-              </w:rPr>
-              <w:t>pÉ</w:t>
-            </w:r>
-            <w:proofErr w:type="spellEnd"/>
+              <w:t xml:space="preserve"> | pÉ</w:t>
+            </w:r>
             <w:r>
               <w:rPr>
                 <w:rFonts w:ascii="BRH Malayalam Extra" w:hAnsi="BRH Malayalam Extra" w:cs="BRH Devanagari Extra"/>
@@ -7126,19 +8172,8 @@
                 <w:sz w:val="28"/>
                 <w:szCs w:val="32"/>
               </w:rPr>
-              <w:t xml:space="preserve">T.S.4.4.4.6 – </w:t>
-            </w:r>
-            <w:proofErr w:type="spellStart"/>
-            <w:r>
-              <w:rPr>
-                <w:rFonts w:cs="Arial"/>
-                <w:b/>
-                <w:sz w:val="28"/>
-                <w:szCs w:val="32"/>
-              </w:rPr>
-              <w:t>Kramam</w:t>
-            </w:r>
-            <w:proofErr w:type="spellEnd"/>
+              <w:t>T.S.4.4.4.6 – Kramam</w:t>
+            </w:r>
           </w:p>
           <w:p>
             <w:pPr>
@@ -7393,19 +8428,8 @@
                 <w:sz w:val="40"/>
                 <w:szCs w:val="40"/>
               </w:rPr>
-              <w:t xml:space="preserve">× - </w:t>
-            </w:r>
-            <w:proofErr w:type="spellStart"/>
-            <w:r>
-              <w:rPr>
-                <w:rFonts w:ascii="BRH Devanagari Extra" w:hAnsi="BRH Devanagari Extra" w:cs="BRH Devanagari Extra"/>
-                <w:color w:val="000000"/>
-                <w:sz w:val="40"/>
-                <w:szCs w:val="40"/>
-              </w:rPr>
-              <w:t>prÉ</w:t>
-            </w:r>
-            <w:proofErr w:type="spellEnd"/>
+              <w:t>× - prÉ</w:t>
+            </w:r>
             <w:r>
               <w:rPr>
                 <w:rFonts w:ascii="BRH Malayalam Extra" w:hAnsi="BRH Malayalam Extra" w:cs="BRH Devanagari Extra"/>
@@ -7577,7 +8601,6 @@
               </w:rPr>
               <w:t xml:space="preserve"> </w:t>
             </w:r>
-            <w:proofErr w:type="spellStart"/>
             <w:r>
               <w:rPr>
                 <w:rFonts w:ascii="BRH Devanagari Extra" w:hAnsi="BRH Devanagari Extra" w:cs="BRH Devanagari Extra"/>
@@ -7588,7 +8611,6 @@
               </w:rPr>
               <w:t>xiÉÉ</w:t>
             </w:r>
-            <w:proofErr w:type="spellEnd"/>
             <w:r>
               <w:rPr>
                 <w:rFonts w:ascii="BRH Malayalam Extra" w:hAnsi="BRH Malayalam Extra" w:cs="BRH Devanagari Extra"/>
@@ -7617,19 +8639,8 @@
                 <w:sz w:val="40"/>
                 <w:szCs w:val="40"/>
               </w:rPr>
-              <w:t xml:space="preserve">× - </w:t>
-            </w:r>
-            <w:proofErr w:type="spellStart"/>
-            <w:r>
-              <w:rPr>
-                <w:rFonts w:ascii="BRH Devanagari Extra" w:hAnsi="BRH Devanagari Extra" w:cs="BRH Devanagari Extra"/>
-                <w:color w:val="000000"/>
-                <w:sz w:val="40"/>
-                <w:szCs w:val="40"/>
-              </w:rPr>
-              <w:t>prÉ</w:t>
-            </w:r>
-            <w:proofErr w:type="spellEnd"/>
+              <w:t>× - prÉ</w:t>
+            </w:r>
             <w:r>
               <w:rPr>
                 <w:rFonts w:ascii="BRH Malayalam Extra" w:hAnsi="BRH Malayalam Extra" w:cs="BRH Devanagari Extra"/>
@@ -7807,19 +8818,8 @@
                 <w:sz w:val="40"/>
                 <w:szCs w:val="40"/>
               </w:rPr>
-              <w:t xml:space="preserve"> | </w:t>
-            </w:r>
-            <w:proofErr w:type="spellStart"/>
-            <w:r>
-              <w:rPr>
-                <w:rFonts w:ascii="BRH Devanagari Extra" w:hAnsi="BRH Devanagari Extra" w:cs="BRH Devanagari Extra"/>
-                <w:color w:val="000000"/>
-                <w:sz w:val="40"/>
-                <w:szCs w:val="40"/>
-              </w:rPr>
-              <w:t>pÉ</w:t>
-            </w:r>
-            <w:proofErr w:type="spellEnd"/>
+              <w:t xml:space="preserve"> | pÉ</w:t>
+            </w:r>
             <w:r>
               <w:rPr>
                 <w:rFonts w:ascii="BRH Malayalam Extra" w:hAnsi="BRH Malayalam Extra" w:cs="BRH Devanagari Extra"/>
@@ -7934,19 +8934,8 @@
                 <w:sz w:val="40"/>
                 <w:szCs w:val="40"/>
               </w:rPr>
-              <w:t xml:space="preserve"> | </w:t>
-            </w:r>
-            <w:proofErr w:type="spellStart"/>
-            <w:r>
-              <w:rPr>
-                <w:rFonts w:ascii="BRH Devanagari Extra" w:hAnsi="BRH Devanagari Extra" w:cs="BRH Devanagari Extra"/>
-                <w:color w:val="000000"/>
-                <w:sz w:val="40"/>
-                <w:szCs w:val="40"/>
-              </w:rPr>
-              <w:t>pÉ</w:t>
-            </w:r>
-            <w:proofErr w:type="spellEnd"/>
+              <w:t xml:space="preserve"> | pÉ</w:t>
+            </w:r>
             <w:r>
               <w:rPr>
                 <w:rFonts w:ascii="BRH Malayalam Extra" w:hAnsi="BRH Malayalam Extra" w:cs="BRH Devanagari Extra"/>
@@ -8156,19 +9145,8 @@
                 <w:sz w:val="40"/>
                 <w:szCs w:val="40"/>
               </w:rPr>
-              <w:t xml:space="preserve"> </w:t>
-            </w:r>
-            <w:proofErr w:type="spellStart"/>
-            <w:r>
-              <w:rPr>
-                <w:rFonts w:ascii="BRH Devanagari Extra" w:hAnsi="BRH Devanagari Extra" w:cs="BRH Devanagari Extra"/>
-                <w:color w:val="000000"/>
-                <w:sz w:val="40"/>
-                <w:szCs w:val="40"/>
-              </w:rPr>
-              <w:t>xÉ</w:t>
-            </w:r>
-            <w:proofErr w:type="spellEnd"/>
+              <w:t xml:space="preserve"> xÉ</w:t>
+            </w:r>
             <w:r>
               <w:rPr>
                 <w:rFonts w:ascii="BRH Malayalam Extra" w:hAnsi="BRH Malayalam Extra" w:cs="BRH Devanagari Extra"/>
@@ -8242,19 +9220,8 @@
                 <w:sz w:val="40"/>
                 <w:szCs w:val="40"/>
               </w:rPr>
-              <w:t xml:space="preserve"> </w:t>
-            </w:r>
-            <w:proofErr w:type="spellStart"/>
-            <w:r>
-              <w:rPr>
-                <w:rFonts w:ascii="BRH Devanagari Extra" w:hAnsi="BRH Devanagari Extra" w:cs="BRH Devanagari Extra"/>
-                <w:color w:val="000000"/>
-                <w:sz w:val="40"/>
-                <w:szCs w:val="40"/>
-              </w:rPr>
-              <w:t>xÉ</w:t>
-            </w:r>
-            <w:proofErr w:type="spellEnd"/>
+              <w:t xml:space="preserve"> xÉ</w:t>
+            </w:r>
             <w:r>
               <w:rPr>
                 <w:rFonts w:ascii="BRH Malayalam Extra" w:hAnsi="BRH Malayalam Extra" w:cs="BRH Devanagari Extra"/>
@@ -8320,7 +9287,6 @@
                 <w:sz w:val="28"/>
                 <w:szCs w:val="32"/>
               </w:rPr>
-              <w:lastRenderedPageBreak/>
               <w:t>T.S.4.4.6.2 – Kramam</w:t>
             </w:r>
           </w:p>
@@ -8925,19 +9891,8 @@
                 <w:sz w:val="28"/>
                 <w:szCs w:val="32"/>
               </w:rPr>
-              <w:t xml:space="preserve">T.S.4.4.6.2 – </w:t>
-            </w:r>
-            <w:proofErr w:type="spellStart"/>
-            <w:r>
-              <w:rPr>
-                <w:rFonts w:cs="Arial"/>
-                <w:b/>
-                <w:sz w:val="28"/>
-                <w:szCs w:val="32"/>
-              </w:rPr>
-              <w:t>Kramam</w:t>
-            </w:r>
-            <w:proofErr w:type="spellEnd"/>
+              <w:t>T.S.4.4.6.2 – Kramam</w:t>
+            </w:r>
           </w:p>
           <w:p>
             <w:pPr>
@@ -9332,7 +10287,6 @@
               </w:rPr>
               <w:t>–</w:t>
             </w:r>
-            <w:proofErr w:type="spellStart"/>
             <w:r>
               <w:rPr>
                 <w:rFonts w:ascii="BRH Devanagari Extra" w:eastAsia="Times New Roman" w:hAnsi="BRH Devanagari Extra" w:cs="BRH Devanagari Extra"/>
@@ -9344,6 +10298,7 @@
               </w:rPr>
               <w:t>Uç</w:t>
             </w:r>
+            <w:proofErr w:type="spellStart"/>
             <w:r>
               <w:rPr>
                 <w:rFonts w:ascii="BRH Devanagari Extra" w:hAnsi="BRH Devanagari Extra" w:cs="BRH Devanagari Extra"/>
@@ -9431,6 +10386,7 @@
                 <w:sz w:val="28"/>
                 <w:szCs w:val="32"/>
               </w:rPr>
+              <w:lastRenderedPageBreak/>
               <w:t>T.S.4.4.9.1 – Kramam</w:t>
             </w:r>
           </w:p>
@@ -9595,19 +10551,8 @@
                 <w:sz w:val="40"/>
                 <w:szCs w:val="40"/>
               </w:rPr>
-              <w:t xml:space="preserve"> </w:t>
-            </w:r>
-            <w:proofErr w:type="spellStart"/>
-            <w:r>
-              <w:rPr>
-                <w:rFonts w:ascii="BRH Devanagari Extra" w:hAnsi="BRH Devanagari Extra" w:cs="BRH Devanagari Extra"/>
-                <w:color w:val="000000"/>
-                <w:sz w:val="40"/>
-                <w:szCs w:val="40"/>
-              </w:rPr>
-              <w:t>rÉ</w:t>
-            </w:r>
-            <w:proofErr w:type="spellEnd"/>
+              <w:t xml:space="preserve"> rÉ</w:t>
+            </w:r>
             <w:r>
               <w:rPr>
                 <w:rFonts w:ascii="BRH Malayalam Extra" w:hAnsi="BRH Malayalam Extra" w:cs="BRH Devanagari Extra"/>
@@ -9736,19 +10681,8 @@
                 <w:sz w:val="40"/>
                 <w:szCs w:val="40"/>
               </w:rPr>
-              <w:t xml:space="preserve"> </w:t>
-            </w:r>
-            <w:proofErr w:type="spellStart"/>
-            <w:r>
-              <w:rPr>
-                <w:rFonts w:ascii="BRH Devanagari Extra" w:hAnsi="BRH Devanagari Extra" w:cs="BRH Devanagari Extra"/>
-                <w:color w:val="000000"/>
-                <w:sz w:val="40"/>
-                <w:szCs w:val="40"/>
-              </w:rPr>
-              <w:t>rÉ</w:t>
-            </w:r>
-            <w:proofErr w:type="spellEnd"/>
+              <w:t xml:space="preserve"> rÉ</w:t>
+            </w:r>
             <w:r>
               <w:rPr>
                 <w:rFonts w:ascii="BRH Malayalam Extra" w:hAnsi="BRH Malayalam Extra" w:cs="BRH Devanagari Extra"/>
@@ -10823,7 +11757,6 @@
                 <w:szCs w:val="40"/>
               </w:rPr>
             </w:pPr>
-            <w:proofErr w:type="spellStart"/>
             <w:r>
               <w:rPr>
                 <w:rFonts w:ascii="BRH Devanagari Extra" w:hAnsi="BRH Devanagari Extra" w:cs="BRH Devanagari Extra"/>
@@ -10833,7 +11766,6 @@
               </w:rPr>
               <w:t>xÉ</w:t>
             </w:r>
-            <w:proofErr w:type="spellEnd"/>
             <w:r>
               <w:rPr>
                 <w:rFonts w:ascii="BRH Malayalam Extra" w:hAnsi="BRH Malayalam Extra" w:cs="BRH Devanagari Extra"/>
@@ -11095,7 +12027,6 @@
                 <w:szCs w:val="40"/>
               </w:rPr>
             </w:pPr>
-            <w:proofErr w:type="spellStart"/>
             <w:r>
               <w:rPr>
                 <w:rFonts w:ascii="BRH Devanagari Extra" w:hAnsi="BRH Devanagari Extra" w:cs="BRH Devanagari Extra"/>
@@ -11105,7 +12036,6 @@
               </w:rPr>
               <w:t>xÉ</w:t>
             </w:r>
-            <w:proofErr w:type="spellEnd"/>
             <w:r>
               <w:rPr>
                 <w:rFonts w:ascii="BRH Malayalam Extra" w:hAnsi="BRH Malayalam Extra" w:cs="BRH Devanagari Extra"/>
@@ -11414,7 +12344,6 @@
                 <w:sz w:val="28"/>
                 <w:szCs w:val="32"/>
               </w:rPr>
-              <w:lastRenderedPageBreak/>
               <w:t>T.S.4.4.11.4 – Kramam</w:t>
             </w:r>
           </w:p>
@@ -11633,7 +12562,6 @@
               </w:rPr>
               <w:t>–</w:t>
             </w:r>
-            <w:proofErr w:type="spellStart"/>
             <w:r>
               <w:rPr>
                 <w:rFonts w:ascii="BRH Devanagari Extra" w:eastAsia="Times New Roman" w:hAnsi="BRH Devanagari Extra" w:cs="BRH Devanagari Extra"/>
@@ -11645,6 +12573,7 @@
               </w:rPr>
               <w:t>Uç</w:t>
             </w:r>
+            <w:proofErr w:type="spellStart"/>
             <w:r>
               <w:rPr>
                 <w:rFonts w:ascii="BRH Devanagari Extra" w:hAnsi="BRH Devanagari Extra" w:cs="BRH Devanagari Extra"/>
@@ -11815,25 +12744,14 @@
                 <w:szCs w:val="40"/>
               </w:rPr>
             </w:pPr>
-            <w:proofErr w:type="spellStart"/>
-            <w:r>
-              <w:rPr>
-                <w:rFonts w:ascii="BRH Devanagari Extra" w:hAnsi="BRH Devanagari Extra" w:cs="BRH Devanagari Extra"/>
-                <w:color w:val="000000"/>
-                <w:sz w:val="40"/>
-                <w:szCs w:val="40"/>
-              </w:rPr>
-              <w:t>oÉ</w:t>
-            </w:r>
-            <w:proofErr w:type="spellEnd"/>
-            <w:r>
-              <w:rPr>
-                <w:rFonts w:ascii="BRH Devanagari Extra" w:hAnsi="BRH Devanagari Extra" w:cs="BRH Devanagari Extra"/>
-                <w:color w:val="000000"/>
-                <w:sz w:val="40"/>
-                <w:szCs w:val="40"/>
-              </w:rPr>
-              <w:t>×</w:t>
+            <w:r>
+              <w:rPr>
+                <w:rFonts w:ascii="BRH Devanagari Extra" w:hAnsi="BRH Devanagari Extra" w:cs="BRH Devanagari Extra"/>
+                <w:color w:val="000000"/>
+                <w:sz w:val="40"/>
+                <w:szCs w:val="40"/>
+              </w:rPr>
+              <w:t>oÉ×</w:t>
             </w:r>
             <w:r>
               <w:rPr>
@@ -11962,25 +12880,14 @@
                 <w:szCs w:val="40"/>
               </w:rPr>
             </w:pPr>
-            <w:proofErr w:type="spellStart"/>
-            <w:r>
-              <w:rPr>
-                <w:rFonts w:ascii="BRH Devanagari Extra" w:hAnsi="BRH Devanagari Extra" w:cs="BRH Devanagari Extra"/>
-                <w:color w:val="000000"/>
-                <w:sz w:val="40"/>
-                <w:szCs w:val="40"/>
-              </w:rPr>
-              <w:t>oÉ</w:t>
-            </w:r>
-            <w:proofErr w:type="spellEnd"/>
-            <w:r>
-              <w:rPr>
-                <w:rFonts w:ascii="BRH Devanagari Extra" w:hAnsi="BRH Devanagari Extra" w:cs="BRH Devanagari Extra"/>
-                <w:color w:val="000000"/>
-                <w:sz w:val="40"/>
-                <w:szCs w:val="40"/>
-              </w:rPr>
-              <w:t>×</w:t>
+            <w:r>
+              <w:rPr>
+                <w:rFonts w:ascii="BRH Devanagari Extra" w:hAnsi="BRH Devanagari Extra" w:cs="BRH Devanagari Extra"/>
+                <w:color w:val="000000"/>
+                <w:sz w:val="40"/>
+                <w:szCs w:val="40"/>
+              </w:rPr>
+              <w:t>oÉ×</w:t>
             </w:r>
             <w:r>
               <w:rPr>
@@ -12461,6 +13368,7 @@
           <w:szCs w:val="40"/>
           <w:lang w:val="en-IN" w:eastAsia="en-IN"/>
         </w:rPr>
+        <w:lastRenderedPageBreak/>
         <w:t>"</w:t>
       </w:r>
       <w:proofErr w:type="spellStart"/>
@@ -12597,8 +13505,6 @@
           <w:bCs/>
         </w:rPr>
       </w:pPr>
-      <w:bookmarkStart w:id="0" w:name="_GoBack"/>
-      <w:bookmarkEnd w:id="0"/>
       <w:r>
         <w:rPr>
           <w:b/>
@@ -12971,7 +13877,7 @@
 </file>
 
 <file path=word/endnotes.xml><?xml version="1.0" encoding="utf-8"?>
-<w:endnotes xmlns:wpc="http://schemas.microsoft.com/office/word/2010/wordprocessingCanvas" xmlns:cx="http://schemas.microsoft.com/office/drawing/2014/chartex" xmlns:cx1="http://schemas.microsoft.com/office/drawing/2015/9/8/chartex" xmlns:mc="http://schemas.openxmlformats.org/markup-compatibility/2006" xmlns:o="urn:schemas-microsoft-com:office:office" xmlns:r="http://schemas.openxmlformats.org/officeDocument/2006/relationships" xmlns:m="http://schemas.openxmlformats.org/officeDocument/2006/math" xmlns:v="urn:schemas-microsoft-com:vml" xmlns:wp14="http://schemas.microsoft.com/office/word/2010/wordprocessingDrawing" xmlns:wp="http://schemas.openxmlformats.org/drawingml/2006/wordprocessingDrawing" xmlns:w10="urn:schemas-microsoft-com:office:word" xmlns:w="http://schemas.openxmlformats.org/wordprocessingml/2006/main" xmlns:w14="http://schemas.microsoft.com/office/word/2010/wordml" xmlns:w15="http://schemas.microsoft.com/office/word/2012/wordml" xmlns:w16se="http://schemas.microsoft.com/office/word/2015/wordml/symex" xmlns:wpg="http://schemas.microsoft.com/office/word/2010/wordprocessingGroup" xmlns:wpi="http://schemas.microsoft.com/office/word/2010/wordprocessingInk" xmlns:wne="http://schemas.microsoft.com/office/word/2006/wordml" xmlns:wps="http://schemas.microsoft.com/office/word/2010/wordprocessingShape" mc:Ignorable="w14 w15 w16se wp14">
+<w:endnotes xmlns:wpc="http://schemas.microsoft.com/office/word/2010/wordprocessingCanvas" xmlns:cx="http://schemas.microsoft.com/office/drawing/2014/chartex" xmlns:cx1="http://schemas.microsoft.com/office/drawing/2015/9/8/chartex" xmlns:cx2="http://schemas.microsoft.com/office/drawing/2015/10/21/chartex" xmlns:cx3="http://schemas.microsoft.com/office/drawing/2016/5/9/chartex" xmlns:cx4="http://schemas.microsoft.com/office/drawing/2016/5/10/chartex" xmlns:cx5="http://schemas.microsoft.com/office/drawing/2016/5/11/chartex" xmlns:cx6="http://schemas.microsoft.com/office/drawing/2016/5/12/chartex" xmlns:cx7="http://schemas.microsoft.com/office/drawing/2016/5/13/chartex" xmlns:cx8="http://schemas.microsoft.com/office/drawing/2016/5/14/chartex" xmlns:mc="http://schemas.openxmlformats.org/markup-compatibility/2006" xmlns:aink="http://schemas.microsoft.com/office/drawing/2016/ink" xmlns:am3d="http://schemas.microsoft.com/office/drawing/2017/model3d" xmlns:o="urn:schemas-microsoft-com:office:office" xmlns:oel="http://schemas.microsoft.com/office/2019/extlst" xmlns:r="http://schemas.openxmlformats.org/officeDocument/2006/relationships" xmlns:m="http://schemas.openxmlformats.org/officeDocument/2006/math" xmlns:v="urn:schemas-microsoft-com:vml" xmlns:wp14="http://schemas.microsoft.com/office/word/2010/wordprocessingDrawing" xmlns:wp="http://schemas.openxmlformats.org/drawingml/2006/wordprocessingDrawing" xmlns:w10="urn:schemas-microsoft-com:office:word" xmlns:w="http://schemas.openxmlformats.org/wordprocessingml/2006/main" xmlns:w14="http://schemas.microsoft.com/office/word/2010/wordml" xmlns:w15="http://schemas.microsoft.com/office/word/2012/wordml" xmlns:w16cei="http://schemas.microsoft.com/office/word/2026/wordml/cei" xmlns:w16cex="http://schemas.microsoft.com/office/word/2018/wordml/cex" xmlns:w16cid="http://schemas.microsoft.com/office/word/2016/wordml/cid" xmlns:w16="http://schemas.microsoft.com/office/word/2018/wordml" xmlns:w16du="http://schemas.microsoft.com/office/word/2023/wordml/word16du" xmlns:w16sdtdh="http://schemas.microsoft.com/office/word/2020/wordml/sdtdatahash" xmlns:w16sdtfl="http://schemas.microsoft.com/office/word/2024/wordml/sdtformatlock" xmlns:w16se="http://schemas.microsoft.com/office/word/2015/wordml/symex" xmlns:wpg="http://schemas.microsoft.com/office/word/2010/wordprocessingGroup" xmlns:wpi="http://schemas.microsoft.com/office/word/2010/wordprocessingInk" xmlns:wne="http://schemas.microsoft.com/office/word/2006/wordml" xmlns:wps="http://schemas.microsoft.com/office/word/2010/wordprocessingShape" mc:Ignorable="w14 w15 w16se w16cid w16 w16cex w16sdtdh w16sdtfl w16du wp14">
   <w:endnote w:type="separator" w:id="-1">
     <w:p>
       <w:pPr>
@@ -12996,7 +13902,7 @@
 </file>
 
 <file path=word/footer1.xml><?xml version="1.0" encoding="utf-8"?>
-<w:ftr xmlns:wpc="http://schemas.microsoft.com/office/word/2010/wordprocessingCanvas" xmlns:cx="http://schemas.microsoft.com/office/drawing/2014/chartex" xmlns:cx1="http://schemas.microsoft.com/office/drawing/2015/9/8/chartex" xmlns:mc="http://schemas.openxmlformats.org/markup-compatibility/2006" xmlns:o="urn:schemas-microsoft-com:office:office" xmlns:r="http://schemas.openxmlformats.org/officeDocument/2006/relationships" xmlns:m="http://schemas.openxmlformats.org/officeDocument/2006/math" xmlns:v="urn:schemas-microsoft-com:vml" xmlns:wp14="http://schemas.microsoft.com/office/word/2010/wordprocessingDrawing" xmlns:wp="http://schemas.openxmlformats.org/drawingml/2006/wordprocessingDrawing" xmlns:w10="urn:schemas-microsoft-com:office:word" xmlns:w="http://schemas.openxmlformats.org/wordprocessingml/2006/main" xmlns:w14="http://schemas.microsoft.com/office/word/2010/wordml" xmlns:w15="http://schemas.microsoft.com/office/word/2012/wordml" xmlns:w16se="http://schemas.microsoft.com/office/word/2015/wordml/symex" xmlns:wpg="http://schemas.microsoft.com/office/word/2010/wordprocessingGroup" xmlns:wpi="http://schemas.microsoft.com/office/word/2010/wordprocessingInk" xmlns:wne="http://schemas.microsoft.com/office/word/2006/wordml" xmlns:wps="http://schemas.microsoft.com/office/word/2010/wordprocessingShape" mc:Ignorable="w14 w15 w16se wp14">
+<w:ftr xmlns:wpc="http://schemas.microsoft.com/office/word/2010/wordprocessingCanvas" xmlns:cx="http://schemas.microsoft.com/office/drawing/2014/chartex" xmlns:cx1="http://schemas.microsoft.com/office/drawing/2015/9/8/chartex" xmlns:cx2="http://schemas.microsoft.com/office/drawing/2015/10/21/chartex" xmlns:cx3="http://schemas.microsoft.com/office/drawing/2016/5/9/chartex" xmlns:cx4="http://schemas.microsoft.com/office/drawing/2016/5/10/chartex" xmlns:cx5="http://schemas.microsoft.com/office/drawing/2016/5/11/chartex" xmlns:cx6="http://schemas.microsoft.com/office/drawing/2016/5/12/chartex" xmlns:cx7="http://schemas.microsoft.com/office/drawing/2016/5/13/chartex" xmlns:cx8="http://schemas.microsoft.com/office/drawing/2016/5/14/chartex" xmlns:mc="http://schemas.openxmlformats.org/markup-compatibility/2006" xmlns:aink="http://schemas.microsoft.com/office/drawing/2016/ink" xmlns:am3d="http://schemas.microsoft.com/office/drawing/2017/model3d" xmlns:o="urn:schemas-microsoft-com:office:office" xmlns:oel="http://schemas.microsoft.com/office/2019/extlst" xmlns:r="http://schemas.openxmlformats.org/officeDocument/2006/relationships" xmlns:m="http://schemas.openxmlformats.org/officeDocument/2006/math" xmlns:v="urn:schemas-microsoft-com:vml" xmlns:wp14="http://schemas.microsoft.com/office/word/2010/wordprocessingDrawing" xmlns:wp="http://schemas.openxmlformats.org/drawingml/2006/wordprocessingDrawing" xmlns:w10="urn:schemas-microsoft-com:office:word" xmlns:w="http://schemas.openxmlformats.org/wordprocessingml/2006/main" xmlns:w14="http://schemas.microsoft.com/office/word/2010/wordml" xmlns:w15="http://schemas.microsoft.com/office/word/2012/wordml" xmlns:w16cei="http://schemas.microsoft.com/office/word/2026/wordml/cei" xmlns:w16cex="http://schemas.microsoft.com/office/word/2018/wordml/cex" xmlns:w16cid="http://schemas.microsoft.com/office/word/2016/wordml/cid" xmlns:w16="http://schemas.microsoft.com/office/word/2018/wordml" xmlns:w16du="http://schemas.microsoft.com/office/word/2023/wordml/word16du" xmlns:w16sdtdh="http://schemas.microsoft.com/office/word/2020/wordml/sdtdatahash" xmlns:w16sdtfl="http://schemas.microsoft.com/office/word/2024/wordml/sdtformatlock" xmlns:w16se="http://schemas.microsoft.com/office/word/2015/wordml/symex" xmlns:wpg="http://schemas.microsoft.com/office/word/2010/wordprocessingGroup" xmlns:wpi="http://schemas.microsoft.com/office/word/2010/wordprocessingInk" xmlns:wne="http://schemas.microsoft.com/office/word/2006/wordml" xmlns:wps="http://schemas.microsoft.com/office/word/2010/wordprocessingShape" mc:Ignorable="w14 w15 w16se w16cid w16 w16cex w16sdtdh w16sdtfl w16du wp14">
   <w:p>
     <w:pPr>
       <w:pBdr>
@@ -13049,14 +13955,35 @@
         <w:bCs/>
       </w:rPr>
       <w:tab/>
-      <w:t xml:space="preserve">              v</w:t>
+      <w:t xml:space="preserve">             </w:t>
     </w:r>
     <w:r>
       <w:rPr>
         <w:b/>
         <w:bCs/>
       </w:rPr>
-      <w:t>edavms@gmail.com</w:t>
+      <w:t>www.</w:t>
+    </w:r>
+    <w:r>
+      <w:rPr>
+        <w:b/>
+        <w:bCs/>
+      </w:rPr>
+      <w:t>v</w:t>
+    </w:r>
+    <w:r>
+      <w:rPr>
+        <w:b/>
+        <w:bCs/>
+      </w:rPr>
+      <w:t>edavms</w:t>
+    </w:r>
+    <w:r>
+      <w:rPr>
+        <w:b/>
+        <w:bCs/>
+      </w:rPr>
+      <w:t>.in</w:t>
     </w:r>
     <w:r>
       <w:rPr>
@@ -13072,6 +13999,13 @@
       </w:rPr>
       <w:tab/>
       <w:t xml:space="preserve"> </w:t>
+    </w:r>
+    <w:r>
+      <w:rPr>
+        <w:b/>
+        <w:bCs/>
+      </w:rPr>
+      <w:t xml:space="preserve">                      </w:t>
     </w:r>
     <w:r>
       <w:tab/>
@@ -13178,7 +14112,7 @@
 </file>
 
 <file path=word/footer2.xml><?xml version="1.0" encoding="utf-8"?>
-<w:ftr xmlns:wpc="http://schemas.microsoft.com/office/word/2010/wordprocessingCanvas" xmlns:cx="http://schemas.microsoft.com/office/drawing/2014/chartex" xmlns:cx1="http://schemas.microsoft.com/office/drawing/2015/9/8/chartex" xmlns:mc="http://schemas.openxmlformats.org/markup-compatibility/2006" xmlns:o="urn:schemas-microsoft-com:office:office" xmlns:r="http://schemas.openxmlformats.org/officeDocument/2006/relationships" xmlns:m="http://schemas.openxmlformats.org/officeDocument/2006/math" xmlns:v="urn:schemas-microsoft-com:vml" xmlns:wp14="http://schemas.microsoft.com/office/word/2010/wordprocessingDrawing" xmlns:wp="http://schemas.openxmlformats.org/drawingml/2006/wordprocessingDrawing" xmlns:w10="urn:schemas-microsoft-com:office:word" xmlns:w="http://schemas.openxmlformats.org/wordprocessingml/2006/main" xmlns:w14="http://schemas.microsoft.com/office/word/2010/wordml" xmlns:w15="http://schemas.microsoft.com/office/word/2012/wordml" xmlns:w16se="http://schemas.microsoft.com/office/word/2015/wordml/symex" xmlns:wpg="http://schemas.microsoft.com/office/word/2010/wordprocessingGroup" xmlns:wpi="http://schemas.microsoft.com/office/word/2010/wordprocessingInk" xmlns:wne="http://schemas.microsoft.com/office/word/2006/wordml" xmlns:wps="http://schemas.microsoft.com/office/word/2010/wordprocessingShape" mc:Ignorable="w14 w15 w16se wp14">
+<w:ftr xmlns:wpc="http://schemas.microsoft.com/office/word/2010/wordprocessingCanvas" xmlns:cx="http://schemas.microsoft.com/office/drawing/2014/chartex" xmlns:cx1="http://schemas.microsoft.com/office/drawing/2015/9/8/chartex" xmlns:cx2="http://schemas.microsoft.com/office/drawing/2015/10/21/chartex" xmlns:cx3="http://schemas.microsoft.com/office/drawing/2016/5/9/chartex" xmlns:cx4="http://schemas.microsoft.com/office/drawing/2016/5/10/chartex" xmlns:cx5="http://schemas.microsoft.com/office/drawing/2016/5/11/chartex" xmlns:cx6="http://schemas.microsoft.com/office/drawing/2016/5/12/chartex" xmlns:cx7="http://schemas.microsoft.com/office/drawing/2016/5/13/chartex" xmlns:cx8="http://schemas.microsoft.com/office/drawing/2016/5/14/chartex" xmlns:mc="http://schemas.openxmlformats.org/markup-compatibility/2006" xmlns:aink="http://schemas.microsoft.com/office/drawing/2016/ink" xmlns:am3d="http://schemas.microsoft.com/office/drawing/2017/model3d" xmlns:o="urn:schemas-microsoft-com:office:office" xmlns:oel="http://schemas.microsoft.com/office/2019/extlst" xmlns:r="http://schemas.openxmlformats.org/officeDocument/2006/relationships" xmlns:m="http://schemas.openxmlformats.org/officeDocument/2006/math" xmlns:v="urn:schemas-microsoft-com:vml" xmlns:wp14="http://schemas.microsoft.com/office/word/2010/wordprocessingDrawing" xmlns:wp="http://schemas.openxmlformats.org/drawingml/2006/wordprocessingDrawing" xmlns:w10="urn:schemas-microsoft-com:office:word" xmlns:w="http://schemas.openxmlformats.org/wordprocessingml/2006/main" xmlns:w14="http://schemas.microsoft.com/office/word/2010/wordml" xmlns:w15="http://schemas.microsoft.com/office/word/2012/wordml" xmlns:w16cei="http://schemas.microsoft.com/office/word/2026/wordml/cei" xmlns:w16cex="http://schemas.microsoft.com/office/word/2018/wordml/cex" xmlns:w16cid="http://schemas.microsoft.com/office/word/2016/wordml/cid" xmlns:w16="http://schemas.microsoft.com/office/word/2018/wordml" xmlns:w16du="http://schemas.microsoft.com/office/word/2023/wordml/word16du" xmlns:w16sdtdh="http://schemas.microsoft.com/office/word/2020/wordml/sdtdatahash" xmlns:w16sdtfl="http://schemas.microsoft.com/office/word/2024/wordml/sdtformatlock" xmlns:w16se="http://schemas.microsoft.com/office/word/2015/wordml/symex" xmlns:wpg="http://schemas.microsoft.com/office/word/2010/wordprocessingGroup" xmlns:wpi="http://schemas.microsoft.com/office/word/2010/wordprocessingInk" xmlns:wne="http://schemas.microsoft.com/office/word/2006/wordml" xmlns:wps="http://schemas.microsoft.com/office/word/2010/wordprocessingShape" mc:Ignorable="w14 w15 w16se w16cid w16 w16cex w16sdtdh w16sdtfl w16du wp14">
   <w:p>
     <w:pPr>
       <w:pBdr>
@@ -13266,6 +14200,19 @@
         <w:bCs/>
       </w:rPr>
       <w:tab/>
+    </w:r>
+    <w:r>
+      <w:rPr>
+        <w:b/>
+        <w:bCs/>
+      </w:rPr>
+      <w:t xml:space="preserve">            </w:t>
+    </w:r>
+    <w:r>
+      <w:rPr>
+        <w:b/>
+        <w:bCs/>
+      </w:rPr>
       <w:t xml:space="preserve"> </w:t>
     </w:r>
     <w:r>
@@ -13381,7 +14328,7 @@
 </file>
 
 <file path=word/footnotes.xml><?xml version="1.0" encoding="utf-8"?>
-<w:footnotes xmlns:wpc="http://schemas.microsoft.com/office/word/2010/wordprocessingCanvas" xmlns:cx="http://schemas.microsoft.com/office/drawing/2014/chartex" xmlns:cx1="http://schemas.microsoft.com/office/drawing/2015/9/8/chartex" xmlns:mc="http://schemas.openxmlformats.org/markup-compatibility/2006" xmlns:o="urn:schemas-microsoft-com:office:office" xmlns:r="http://schemas.openxmlformats.org/officeDocument/2006/relationships" xmlns:m="http://schemas.openxmlformats.org/officeDocument/2006/math" xmlns:v="urn:schemas-microsoft-com:vml" xmlns:wp14="http://schemas.microsoft.com/office/word/2010/wordprocessingDrawing" xmlns:wp="http://schemas.openxmlformats.org/drawingml/2006/wordprocessingDrawing" xmlns:w10="urn:schemas-microsoft-com:office:word" xmlns:w="http://schemas.openxmlformats.org/wordprocessingml/2006/main" xmlns:w14="http://schemas.microsoft.com/office/word/2010/wordml" xmlns:w15="http://schemas.microsoft.com/office/word/2012/wordml" xmlns:w16se="http://schemas.microsoft.com/office/word/2015/wordml/symex" xmlns:wpg="http://schemas.microsoft.com/office/word/2010/wordprocessingGroup" xmlns:wpi="http://schemas.microsoft.com/office/word/2010/wordprocessingInk" xmlns:wne="http://schemas.microsoft.com/office/word/2006/wordml" xmlns:wps="http://schemas.microsoft.com/office/word/2010/wordprocessingShape" mc:Ignorable="w14 w15 w16se wp14">
+<w:footnotes xmlns:wpc="http://schemas.microsoft.com/office/word/2010/wordprocessingCanvas" xmlns:cx="http://schemas.microsoft.com/office/drawing/2014/chartex" xmlns:cx1="http://schemas.microsoft.com/office/drawing/2015/9/8/chartex" xmlns:cx2="http://schemas.microsoft.com/office/drawing/2015/10/21/chartex" xmlns:cx3="http://schemas.microsoft.com/office/drawing/2016/5/9/chartex" xmlns:cx4="http://schemas.microsoft.com/office/drawing/2016/5/10/chartex" xmlns:cx5="http://schemas.microsoft.com/office/drawing/2016/5/11/chartex" xmlns:cx6="http://schemas.microsoft.com/office/drawing/2016/5/12/chartex" xmlns:cx7="http://schemas.microsoft.com/office/drawing/2016/5/13/chartex" xmlns:cx8="http://schemas.microsoft.com/office/drawing/2016/5/14/chartex" xmlns:mc="http://schemas.openxmlformats.org/markup-compatibility/2006" xmlns:aink="http://schemas.microsoft.com/office/drawing/2016/ink" xmlns:am3d="http://schemas.microsoft.com/office/drawing/2017/model3d" xmlns:o="urn:schemas-microsoft-com:office:office" xmlns:oel="http://schemas.microsoft.com/office/2019/extlst" xmlns:r="http://schemas.openxmlformats.org/officeDocument/2006/relationships" xmlns:m="http://schemas.openxmlformats.org/officeDocument/2006/math" xmlns:v="urn:schemas-microsoft-com:vml" xmlns:wp14="http://schemas.microsoft.com/office/word/2010/wordprocessingDrawing" xmlns:wp="http://schemas.openxmlformats.org/drawingml/2006/wordprocessingDrawing" xmlns:w10="urn:schemas-microsoft-com:office:word" xmlns:w="http://schemas.openxmlformats.org/wordprocessingml/2006/main" xmlns:w14="http://schemas.microsoft.com/office/word/2010/wordml" xmlns:w15="http://schemas.microsoft.com/office/word/2012/wordml" xmlns:w16cei="http://schemas.microsoft.com/office/word/2026/wordml/cei" xmlns:w16cex="http://schemas.microsoft.com/office/word/2018/wordml/cex" xmlns:w16cid="http://schemas.microsoft.com/office/word/2016/wordml/cid" xmlns:w16="http://schemas.microsoft.com/office/word/2018/wordml" xmlns:w16du="http://schemas.microsoft.com/office/word/2023/wordml/word16du" xmlns:w16sdtdh="http://schemas.microsoft.com/office/word/2020/wordml/sdtdatahash" xmlns:w16sdtfl="http://schemas.microsoft.com/office/word/2024/wordml/sdtformatlock" xmlns:w16se="http://schemas.microsoft.com/office/word/2015/wordml/symex" xmlns:wpg="http://schemas.microsoft.com/office/word/2010/wordprocessingGroup" xmlns:wpi="http://schemas.microsoft.com/office/word/2010/wordprocessingInk" xmlns:wne="http://schemas.microsoft.com/office/word/2006/wordml" xmlns:wps="http://schemas.microsoft.com/office/word/2010/wordprocessingShape" mc:Ignorable="w14 w15 w16se w16cid w16 w16cex w16sdtdh w16sdtfl w16du wp14">
   <w:footnote w:type="separator" w:id="-1">
     <w:p>
       <w:pPr>
@@ -13406,7 +14353,7 @@
 </file>
 
 <file path=word/header1.xml><?xml version="1.0" encoding="utf-8"?>
-<w:hdr xmlns:wpc="http://schemas.microsoft.com/office/word/2010/wordprocessingCanvas" xmlns:cx="http://schemas.microsoft.com/office/drawing/2014/chartex" xmlns:cx1="http://schemas.microsoft.com/office/drawing/2015/9/8/chartex" xmlns:mc="http://schemas.openxmlformats.org/markup-compatibility/2006" xmlns:o="urn:schemas-microsoft-com:office:office" xmlns:r="http://schemas.openxmlformats.org/officeDocument/2006/relationships" xmlns:m="http://schemas.openxmlformats.org/officeDocument/2006/math" xmlns:v="urn:schemas-microsoft-com:vml" xmlns:wp14="http://schemas.microsoft.com/office/word/2010/wordprocessingDrawing" xmlns:wp="http://schemas.openxmlformats.org/drawingml/2006/wordprocessingDrawing" xmlns:w10="urn:schemas-microsoft-com:office:word" xmlns:w="http://schemas.openxmlformats.org/wordprocessingml/2006/main" xmlns:w14="http://schemas.microsoft.com/office/word/2010/wordml" xmlns:w15="http://schemas.microsoft.com/office/word/2012/wordml" xmlns:w16se="http://schemas.microsoft.com/office/word/2015/wordml/symex" xmlns:wpg="http://schemas.microsoft.com/office/word/2010/wordprocessingGroup" xmlns:wpi="http://schemas.microsoft.com/office/word/2010/wordprocessingInk" xmlns:wne="http://schemas.microsoft.com/office/word/2006/wordml" xmlns:wps="http://schemas.microsoft.com/office/word/2010/wordprocessingShape" mc:Ignorable="w14 w15 w16se wp14">
+<w:hdr xmlns:wpc="http://schemas.microsoft.com/office/word/2010/wordprocessingCanvas" xmlns:cx="http://schemas.microsoft.com/office/drawing/2014/chartex" xmlns:cx1="http://schemas.microsoft.com/office/drawing/2015/9/8/chartex" xmlns:cx2="http://schemas.microsoft.com/office/drawing/2015/10/21/chartex" xmlns:cx3="http://schemas.microsoft.com/office/drawing/2016/5/9/chartex" xmlns:cx4="http://schemas.microsoft.com/office/drawing/2016/5/10/chartex" xmlns:cx5="http://schemas.microsoft.com/office/drawing/2016/5/11/chartex" xmlns:cx6="http://schemas.microsoft.com/office/drawing/2016/5/12/chartex" xmlns:cx7="http://schemas.microsoft.com/office/drawing/2016/5/13/chartex" xmlns:cx8="http://schemas.microsoft.com/office/drawing/2016/5/14/chartex" xmlns:mc="http://schemas.openxmlformats.org/markup-compatibility/2006" xmlns:aink="http://schemas.microsoft.com/office/drawing/2016/ink" xmlns:am3d="http://schemas.microsoft.com/office/drawing/2017/model3d" xmlns:o="urn:schemas-microsoft-com:office:office" xmlns:oel="http://schemas.microsoft.com/office/2019/extlst" xmlns:r="http://schemas.openxmlformats.org/officeDocument/2006/relationships" xmlns:m="http://schemas.openxmlformats.org/officeDocument/2006/math" xmlns:v="urn:schemas-microsoft-com:vml" xmlns:wp14="http://schemas.microsoft.com/office/word/2010/wordprocessingDrawing" xmlns:wp="http://schemas.openxmlformats.org/drawingml/2006/wordprocessingDrawing" xmlns:w10="urn:schemas-microsoft-com:office:word" xmlns:w="http://schemas.openxmlformats.org/wordprocessingml/2006/main" xmlns:w14="http://schemas.microsoft.com/office/word/2010/wordml" xmlns:w15="http://schemas.microsoft.com/office/word/2012/wordml" xmlns:w16cei="http://schemas.microsoft.com/office/word/2026/wordml/cei" xmlns:w16cex="http://schemas.microsoft.com/office/word/2018/wordml/cex" xmlns:w16cid="http://schemas.microsoft.com/office/word/2016/wordml/cid" xmlns:w16="http://schemas.microsoft.com/office/word/2018/wordml" xmlns:w16du="http://schemas.microsoft.com/office/word/2023/wordml/word16du" xmlns:w16sdtdh="http://schemas.microsoft.com/office/word/2020/wordml/sdtdatahash" xmlns:w16sdtfl="http://schemas.microsoft.com/office/word/2024/wordml/sdtformatlock" xmlns:w16se="http://schemas.microsoft.com/office/word/2015/wordml/symex" xmlns:wpg="http://schemas.microsoft.com/office/word/2010/wordprocessingGroup" xmlns:wpi="http://schemas.microsoft.com/office/word/2010/wordprocessingInk" xmlns:wne="http://schemas.microsoft.com/office/word/2006/wordml" xmlns:wps="http://schemas.microsoft.com/office/word/2010/wordprocessingShape" mc:Ignorable="w14 w15 w16se w16cid w16 w16cex w16sdtdh w16sdtfl w16du wp14">
   <w:p>
     <w:pPr>
       <w:pStyle w:val="Header"/>
@@ -13419,7 +14366,7 @@
 </file>
 
 <file path=word/header2.xml><?xml version="1.0" encoding="utf-8"?>
-<w:hdr xmlns:wpc="http://schemas.microsoft.com/office/word/2010/wordprocessingCanvas" xmlns:cx="http://schemas.microsoft.com/office/drawing/2014/chartex" xmlns:cx1="http://schemas.microsoft.com/office/drawing/2015/9/8/chartex" xmlns:mc="http://schemas.openxmlformats.org/markup-compatibility/2006" xmlns:o="urn:schemas-microsoft-com:office:office" xmlns:r="http://schemas.openxmlformats.org/officeDocument/2006/relationships" xmlns:m="http://schemas.openxmlformats.org/officeDocument/2006/math" xmlns:v="urn:schemas-microsoft-com:vml" xmlns:wp14="http://schemas.microsoft.com/office/word/2010/wordprocessingDrawing" xmlns:wp="http://schemas.openxmlformats.org/drawingml/2006/wordprocessingDrawing" xmlns:w10="urn:schemas-microsoft-com:office:word" xmlns:w="http://schemas.openxmlformats.org/wordprocessingml/2006/main" xmlns:w14="http://schemas.microsoft.com/office/word/2010/wordml" xmlns:w15="http://schemas.microsoft.com/office/word/2012/wordml" xmlns:w16se="http://schemas.microsoft.com/office/word/2015/wordml/symex" xmlns:wpg="http://schemas.microsoft.com/office/word/2010/wordprocessingGroup" xmlns:wpi="http://schemas.microsoft.com/office/word/2010/wordprocessingInk" xmlns:wne="http://schemas.microsoft.com/office/word/2006/wordml" xmlns:wps="http://schemas.microsoft.com/office/word/2010/wordprocessingShape" mc:Ignorable="w14 w15 w16se wp14">
+<w:hdr xmlns:wpc="http://schemas.microsoft.com/office/word/2010/wordprocessingCanvas" xmlns:cx="http://schemas.microsoft.com/office/drawing/2014/chartex" xmlns:cx1="http://schemas.microsoft.com/office/drawing/2015/9/8/chartex" xmlns:cx2="http://schemas.microsoft.com/office/drawing/2015/10/21/chartex" xmlns:cx3="http://schemas.microsoft.com/office/drawing/2016/5/9/chartex" xmlns:cx4="http://schemas.microsoft.com/office/drawing/2016/5/10/chartex" xmlns:cx5="http://schemas.microsoft.com/office/drawing/2016/5/11/chartex" xmlns:cx6="http://schemas.microsoft.com/office/drawing/2016/5/12/chartex" xmlns:cx7="http://schemas.microsoft.com/office/drawing/2016/5/13/chartex" xmlns:cx8="http://schemas.microsoft.com/office/drawing/2016/5/14/chartex" xmlns:mc="http://schemas.openxmlformats.org/markup-compatibility/2006" xmlns:aink="http://schemas.microsoft.com/office/drawing/2016/ink" xmlns:am3d="http://schemas.microsoft.com/office/drawing/2017/model3d" xmlns:o="urn:schemas-microsoft-com:office:office" xmlns:oel="http://schemas.microsoft.com/office/2019/extlst" xmlns:r="http://schemas.openxmlformats.org/officeDocument/2006/relationships" xmlns:m="http://schemas.openxmlformats.org/officeDocument/2006/math" xmlns:v="urn:schemas-microsoft-com:vml" xmlns:wp14="http://schemas.microsoft.com/office/word/2010/wordprocessingDrawing" xmlns:wp="http://schemas.openxmlformats.org/drawingml/2006/wordprocessingDrawing" xmlns:w10="urn:schemas-microsoft-com:office:word" xmlns:w="http://schemas.openxmlformats.org/wordprocessingml/2006/main" xmlns:w14="http://schemas.microsoft.com/office/word/2010/wordml" xmlns:w15="http://schemas.microsoft.com/office/word/2012/wordml" xmlns:w16cei="http://schemas.microsoft.com/office/word/2026/wordml/cei" xmlns:w16cex="http://schemas.microsoft.com/office/word/2018/wordml/cex" xmlns:w16cid="http://schemas.microsoft.com/office/word/2016/wordml/cid" xmlns:w16="http://schemas.microsoft.com/office/word/2018/wordml" xmlns:w16du="http://schemas.microsoft.com/office/word/2023/wordml/word16du" xmlns:w16sdtdh="http://schemas.microsoft.com/office/word/2020/wordml/sdtdatahash" xmlns:w16sdtfl="http://schemas.microsoft.com/office/word/2024/wordml/sdtformatlock" xmlns:w16se="http://schemas.microsoft.com/office/word/2015/wordml/symex" xmlns:wpg="http://schemas.microsoft.com/office/word/2010/wordprocessingGroup" xmlns:wpi="http://schemas.microsoft.com/office/word/2010/wordprocessingInk" xmlns:wne="http://schemas.microsoft.com/office/word/2006/wordml" xmlns:wps="http://schemas.microsoft.com/office/word/2010/wordprocessingShape" mc:Ignorable="w14 w15 w16se w16cid w16 w16cex w16sdtdh w16sdtfl w16du wp14">
   <w:p>
     <w:pPr>
       <w:pStyle w:val="Header"/>
@@ -13432,7 +14379,7 @@
 </file>
 
 <file path=word/styles.xml><?xml version="1.0" encoding="utf-8"?>
-<w:styles xmlns:mc="http://schemas.openxmlformats.org/markup-compatibility/2006" xmlns:r="http://schemas.openxmlformats.org/officeDocument/2006/relationships" xmlns:w="http://schemas.openxmlformats.org/wordprocessingml/2006/main" xmlns:w14="http://schemas.microsoft.com/office/word/2010/wordml" xmlns:w15="http://schemas.microsoft.com/office/word/2012/wordml" xmlns:w16se="http://schemas.microsoft.com/office/word/2015/wordml/symex" mc:Ignorable="w14 w15 w16se">
+<w:styles xmlns:mc="http://schemas.openxmlformats.org/markup-compatibility/2006" xmlns:r="http://schemas.openxmlformats.org/officeDocument/2006/relationships" xmlns:w="http://schemas.openxmlformats.org/wordprocessingml/2006/main" xmlns:w14="http://schemas.microsoft.com/office/word/2010/wordml" xmlns:w15="http://schemas.microsoft.com/office/word/2012/wordml" xmlns:w16cex="http://schemas.microsoft.com/office/word/2018/wordml/cex" xmlns:w16cid="http://schemas.microsoft.com/office/word/2016/wordml/cid" xmlns:w16="http://schemas.microsoft.com/office/word/2018/wordml" xmlns:w16du="http://schemas.microsoft.com/office/word/2023/wordml/word16du" xmlns:w16sdtdh="http://schemas.microsoft.com/office/word/2020/wordml/sdtdatahash" xmlns:w16sdtfl="http://schemas.microsoft.com/office/word/2024/wordml/sdtformatlock" xmlns:w16se="http://schemas.microsoft.com/office/word/2015/wordml/symex" mc:Ignorable="w14 w15 w16se w16cid w16 w16cex w16sdtdh w16sdtfl w16du">
   <w:docDefaults>
     <w:rPrDefault>
       <w:rPr>
@@ -13442,7 +14389,7 @@
     </w:rPrDefault>
     <w:pPrDefault/>
   </w:docDefaults>
-  <w:latentStyles w:defLockedState="0" w:defUIPriority="99" w:defSemiHidden="0" w:defUnhideWhenUsed="0" w:defQFormat="0" w:count="371">
+  <w:latentStyles w:defLockedState="0" w:defUIPriority="99" w:defSemiHidden="0" w:defUnhideWhenUsed="0" w:defQFormat="0" w:count="376">
     <w:lsdException w:name="Normal" w:uiPriority="0" w:qFormat="1"/>
     <w:lsdException w:name="heading 1" w:uiPriority="9" w:qFormat="1"/>
     <w:lsdException w:name="heading 2" w:semiHidden="1" w:uiPriority="9" w:unhideWhenUsed="1" w:qFormat="1"/>
@@ -13814,11 +14761,16 @@
     <w:lsdException w:name="List Table 5 Dark Accent 6" w:uiPriority="50"/>
     <w:lsdException w:name="List Table 6 Colorful Accent 6" w:uiPriority="51"/>
     <w:lsdException w:name="List Table 7 Colorful Accent 6" w:uiPriority="52"/>
+    <w:lsdException w:name="Mention" w:semiHidden="1" w:unhideWhenUsed="1"/>
+    <w:lsdException w:name="Smart Hyperlink" w:semiHidden="1" w:unhideWhenUsed="1"/>
+    <w:lsdException w:name="Hashtag" w:semiHidden="1" w:unhideWhenUsed="1"/>
+    <w:lsdException w:name="Unresolved Mention" w:semiHidden="1" w:unhideWhenUsed="1"/>
+    <w:lsdException w:name="Smart Link" w:semiHidden="1" w:unhideWhenUsed="1"/>
   </w:latentStyles>
   <w:style w:type="paragraph" w:default="1" w:styleId="Normal">
     <w:name w:val="Normal"/>
     <w:qFormat/>
-    <w:rsid w:val="00076C05"/>
+    <w:rsid w:val="0004103B"/>
     <w:pPr>
       <w:spacing w:before="120" w:line="276" w:lineRule="auto"/>
     </w:pPr>

</xml_diff>